<commit_message>
Anleitung: Admin-Kapitel in eigenes Dokument ausgelagert
Kapitel 6 "Verwaltungsbereich (Admin)" (6.1-6.7) ist aus der
Kunden-Anleitung entfernt -- das geht normale Mitglieder nichts an.
Komplett in ein neues, eigenständiges Dokument verschoben:
FoodCoopAlteEicheWebshopAnleitung-Admin.docx/.pdf, mit eigenem Titel
und Hinweis, dass es nur für die Verwaltung gedacht ist. Nicht von der
Webseite aus verlinkt (bewusst kein Button/Link im Shop).

In der Kunden-Anleitung wurde das bisherige Kapitel 7 "Ablauf einer
Bestellung" entsprechend zu Kapitel 6 umnummeriert (Inhaltsverzeichnis
und Überschrift), und die Inhaltsverzeichnis-Seitenzahlen wurden auf den
neuen, kürzeren Stand korrigiert (<w:updateFields> zusätzlich gesetzt,
damit Word sie beim Öffnen ohnehin automatisch neu berechnet).

Co-Authored-By: Claude Sonnet 5 <noreply@anthropic.com>
Claude-Session: https://claude.ai/code/session_01Cv8pt3jB9jwN7WHjt8S9jj
</commit_message>
<xml_diff>
--- a/FoodCoopAlteEicheWebshopAnleitung.docx
+++ b/FoodCoopAlteEicheWebshopAnleitung.docx
@@ -122,7 +122,7 @@
         <w:rPr>
           <w:noProof/>
         </w:rPr>
-        <w:t>2</w:t>
+        <w:t>1</w:t>
       </w:r>
       <w:r>
         <w:rPr>
@@ -182,7 +182,7 @@
         <w:rPr>
           <w:noProof/>
         </w:rPr>
-        <w:t>3</w:t>
+        <w:t>2</w:t>
       </w:r>
       <w:r>
         <w:rPr>
@@ -242,7 +242,7 @@
         <w:rPr>
           <w:noProof/>
         </w:rPr>
-        <w:t>3</w:t>
+        <w:t>2</w:t>
       </w:r>
       <w:r>
         <w:rPr>
@@ -302,7 +302,7 @@
         <w:rPr>
           <w:noProof/>
         </w:rPr>
-        <w:t>3</w:t>
+        <w:t>2</w:t>
       </w:r>
       <w:r>
         <w:rPr>
@@ -362,7 +362,7 @@
         <w:rPr>
           <w:noProof/>
         </w:rPr>
-        <w:t>5</w:t>
+        <w:t>4</w:t>
       </w:r>
       <w:r>
         <w:rPr>
@@ -422,7 +422,7 @@
         <w:rPr>
           <w:noProof/>
         </w:rPr>
-        <w:t>7</w:t>
+        <w:t>5</w:t>
       </w:r>
       <w:r>
         <w:rPr>
@@ -482,7 +482,7 @@
         <w:rPr>
           <w:noProof/>
         </w:rPr>
-        <w:t>8</w:t>
+        <w:t>6</w:t>
       </w:r>
       <w:r>
         <w:rPr>
@@ -542,7 +542,7 @@
         <w:rPr>
           <w:noProof/>
         </w:rPr>
-        <w:t>9</w:t>
+        <w:t>7</w:t>
       </w:r>
       <w:r>
         <w:rPr>
@@ -602,7 +602,7 @@
         <w:rPr>
           <w:noProof/>
         </w:rPr>
-        <w:t>10</w:t>
+        <w:t>8</w:t>
       </w:r>
       <w:r>
         <w:rPr>
@@ -660,7 +660,7 @@
         <w:rPr>
           <w:noProof/>
         </w:rPr>
-        <w:t>10</w:t>
+        <w:t>9</w:t>
       </w:r>
       <w:r>
         <w:rPr>
@@ -720,7 +720,7 @@
         <w:rPr>
           <w:noProof/>
         </w:rPr>
-        <w:t>11</w:t>
+        <w:t>10</w:t>
       </w:r>
       <w:r>
         <w:rPr>
@@ -745,7 +745,7 @@
         <w:rPr>
           <w:noProof/>
         </w:rPr>
-        <w:t>6. Verwaltungsbereich (Admin)</w:t>
+        <w:t>6. Ablauf einer Bestellung - Schritt für Schritt</w:t>
       </w:r>
       <w:r>
         <w:rPr>
@@ -763,7 +763,7 @@
         <w:rPr>
           <w:noProof/>
         </w:rPr>
-        <w:instrText xml:space="preserve"> PAGEREF _Toc238900578 \h </w:instrText>
+        <w:instrText xml:space="preserve"> PAGEREF _Toc238900586 \h </w:instrText>
       </w:r>
       <w:r>
         <w:rPr>
@@ -805,7 +805,7 @@
         <w:rPr>
           <w:noProof/>
         </w:rPr>
-        <w:t>6.1 Admin-Passwort einrichten</w:t>
+        <w:t>Schritt 1: Artikel suchen</w:t>
       </w:r>
       <w:r>
         <w:rPr>
@@ -823,7 +823,7 @@
         <w:rPr>
           <w:noProof/>
         </w:rPr>
-        <w:instrText xml:space="preserve"> PAGEREF _Toc238900579 \h </w:instrText>
+        <w:instrText xml:space="preserve"> PAGEREF _Toc238900587 \h </w:instrText>
       </w:r>
       <w:r>
         <w:rPr>
@@ -865,7 +865,7 @@
         <w:rPr>
           <w:noProof/>
         </w:rPr>
-        <w:t>6.2 Verwaltungsbereich gesperrt</w:t>
+        <w:t>Schritt 2: Menge festlegen und in den Warenkorb legen</w:t>
       </w:r>
       <w:r>
         <w:rPr>
@@ -883,7 +883,7 @@
         <w:rPr>
           <w:noProof/>
         </w:rPr>
-        <w:instrText xml:space="preserve"> PAGEREF _Toc238900580 \h </w:instrText>
+        <w:instrText xml:space="preserve"> PAGEREF _Toc238900588 \h </w:instrText>
       </w:r>
       <w:r>
         <w:rPr>
@@ -925,7 +925,7 @@
         <w:rPr>
           <w:noProof/>
         </w:rPr>
-        <w:t>6.3 Status</w:t>
+        <w:t>Schritt 3: Warenkorb prüfen</w:t>
       </w:r>
       <w:r>
         <w:rPr>
@@ -943,7 +943,7 @@
         <w:rPr>
           <w:noProof/>
         </w:rPr>
-        <w:instrText xml:space="preserve"> PAGEREF _Toc238900581 \h </w:instrText>
+        <w:instrText xml:space="preserve"> PAGEREF _Toc238900589 \h </w:instrText>
       </w:r>
       <w:r>
         <w:rPr>
@@ -960,7 +960,7 @@
         <w:rPr>
           <w:noProof/>
         </w:rPr>
-        <w:t>15</w:t>
+        <w:t>14</w:t>
       </w:r>
       <w:r>
         <w:rPr>
@@ -985,7 +985,7 @@
         <w:rPr>
           <w:noProof/>
         </w:rPr>
-        <w:t>6.4 Produktkatalog je Kategorie</w:t>
+        <w:t>Schritt 4: Zur Bestellübersicht wechseln und Daten eingeben</w:t>
       </w:r>
       <w:r>
         <w:rPr>
@@ -1003,7 +1003,7 @@
         <w:rPr>
           <w:noProof/>
         </w:rPr>
-        <w:instrText xml:space="preserve"> PAGEREF _Toc238900582 \h </w:instrText>
+        <w:instrText xml:space="preserve"> PAGEREF _Toc238900590 \h </w:instrText>
       </w:r>
       <w:r>
         <w:rPr>
@@ -1020,7 +1020,7 @@
         <w:rPr>
           <w:noProof/>
         </w:rPr>
-        <w:t>15</w:t>
+        <w:t>14</w:t>
       </w:r>
       <w:r>
         <w:rPr>
@@ -1045,7 +1045,7 @@
         <w:rPr>
           <w:noProof/>
         </w:rPr>
-        <w:t>6.5 Prozentzuschläge</w:t>
+        <w:t>Schritt 5: Bestellung abschließen</w:t>
       </w:r>
       <w:r>
         <w:rPr>
@@ -1063,7 +1063,7 @@
         <w:rPr>
           <w:noProof/>
         </w:rPr>
-        <w:instrText xml:space="preserve"> PAGEREF _Toc238900583 \h </w:instrText>
+        <w:instrText xml:space="preserve"> PAGEREF _Toc238900591 \h </w:instrText>
       </w:r>
       <w:r>
         <w:rPr>
@@ -1080,487 +1080,7 @@
         <w:rPr>
           <w:noProof/>
         </w:rPr>
-        <w:t>16</w:t>
-      </w:r>
-      <w:r>
-        <w:rPr>
-          <w:noProof/>
-        </w:rPr>
-        <w:fldChar w:fldCharType="end"/>
-      </w:r>
-    </w:p>
-    <w:p>
-      <w:pPr>
-        <w:pStyle w:val="Verzeichnis2"/>
-        <w:tabs>
-          <w:tab w:val="right" w:leader="dot" w:pos="9062"/>
-        </w:tabs>
-        <w:rPr>
-          <w:rFonts w:eastAsiaTheme="minorEastAsia"/>
-          <w:noProof/>
-          <w:lang w:eastAsia="de-DE"/>
-        </w:rPr>
-      </w:pPr>
-      <w:r>
-        <w:rPr>
-          <w:noProof/>
-        </w:rPr>
-        <w:t>6.6 Kundenkonten</w:t>
-      </w:r>
-      <w:r>
-        <w:rPr>
-          <w:noProof/>
-        </w:rPr>
-        <w:tab/>
-      </w:r>
-      <w:r>
-        <w:rPr>
-          <w:noProof/>
-        </w:rPr>
-        <w:fldChar w:fldCharType="begin"/>
-      </w:r>
-      <w:r>
-        <w:rPr>
-          <w:noProof/>
-        </w:rPr>
-        <w:instrText xml:space="preserve"> PAGEREF _Toc238900584 \h </w:instrText>
-      </w:r>
-      <w:r>
-        <w:rPr>
-          <w:noProof/>
-        </w:rPr>
-      </w:r>
-      <w:r>
-        <w:rPr>
-          <w:noProof/>
-        </w:rPr>
-        <w:fldChar w:fldCharType="separate"/>
-      </w:r>
-      <w:r>
-        <w:rPr>
-          <w:noProof/>
-        </w:rPr>
-        <w:t>17</w:t>
-      </w:r>
-      <w:r>
-        <w:rPr>
-          <w:noProof/>
-        </w:rPr>
-        <w:fldChar w:fldCharType="end"/>
-      </w:r>
-    </w:p>
-    <w:p>
-      <w:pPr>
-        <w:pStyle w:val="Verzeichnis2"/>
-        <w:tabs>
-          <w:tab w:val="right" w:leader="dot" w:pos="9062"/>
-        </w:tabs>
-        <w:rPr>
-          <w:rFonts w:eastAsiaTheme="minorEastAsia"/>
-          <w:noProof/>
-          <w:lang w:eastAsia="de-DE"/>
-        </w:rPr>
-      </w:pPr>
-      <w:r>
-        <w:rPr>
-          <w:noProof/>
-        </w:rPr>
-        <w:t>6.7 Admin-Passwort ändern</w:t>
-      </w:r>
-      <w:r>
-        <w:rPr>
-          <w:noProof/>
-        </w:rPr>
-        <w:tab/>
-      </w:r>
-      <w:r>
-        <w:rPr>
-          <w:noProof/>
-        </w:rPr>
-        <w:fldChar w:fldCharType="begin"/>
-      </w:r>
-      <w:r>
-        <w:rPr>
-          <w:noProof/>
-        </w:rPr>
-        <w:instrText xml:space="preserve"> PAGEREF _Toc238900585 \h </w:instrText>
-      </w:r>
-      <w:r>
-        <w:rPr>
-          <w:noProof/>
-        </w:rPr>
-      </w:r>
-      <w:r>
-        <w:rPr>
-          <w:noProof/>
-        </w:rPr>
-        <w:fldChar w:fldCharType="separate"/>
-      </w:r>
-      <w:r>
-        <w:rPr>
-          <w:noProof/>
-        </w:rPr>
-        <w:t>18</w:t>
-      </w:r>
-      <w:r>
-        <w:rPr>
-          <w:noProof/>
-        </w:rPr>
-        <w:fldChar w:fldCharType="end"/>
-      </w:r>
-    </w:p>
-    <w:p>
-      <w:pPr>
-        <w:pStyle w:val="Verzeichnis1"/>
-        <w:tabs>
-          <w:tab w:val="right" w:leader="dot" w:pos="9062"/>
-        </w:tabs>
-        <w:rPr>
-          <w:rFonts w:eastAsiaTheme="minorEastAsia"/>
-          <w:noProof/>
-          <w:lang w:eastAsia="de-DE"/>
-        </w:rPr>
-      </w:pPr>
-      <w:r>
-        <w:rPr>
-          <w:noProof/>
-        </w:rPr>
-        <w:t>7. Ablauf einer Bestellung - Schritt für Schritt</w:t>
-      </w:r>
-      <w:r>
-        <w:rPr>
-          <w:noProof/>
-        </w:rPr>
-        <w:tab/>
-      </w:r>
-      <w:r>
-        <w:rPr>
-          <w:noProof/>
-        </w:rPr>
-        <w:fldChar w:fldCharType="begin"/>
-      </w:r>
-      <w:r>
-        <w:rPr>
-          <w:noProof/>
-        </w:rPr>
-        <w:instrText xml:space="preserve"> PAGEREF _Toc238900586 \h </w:instrText>
-      </w:r>
-      <w:r>
-        <w:rPr>
-          <w:noProof/>
-        </w:rPr>
-      </w:r>
-      <w:r>
-        <w:rPr>
-          <w:noProof/>
-        </w:rPr>
-        <w:fldChar w:fldCharType="separate"/>
-      </w:r>
-      <w:r>
-        <w:rPr>
-          <w:noProof/>
-        </w:rPr>
-        <w:t>19</w:t>
-      </w:r>
-      <w:r>
-        <w:rPr>
-          <w:noProof/>
-        </w:rPr>
-        <w:fldChar w:fldCharType="end"/>
-      </w:r>
-    </w:p>
-    <w:p>
-      <w:pPr>
-        <w:pStyle w:val="Verzeichnis2"/>
-        <w:tabs>
-          <w:tab w:val="right" w:leader="dot" w:pos="9062"/>
-        </w:tabs>
-        <w:rPr>
-          <w:rFonts w:eastAsiaTheme="minorEastAsia"/>
-          <w:noProof/>
-          <w:lang w:eastAsia="de-DE"/>
-        </w:rPr>
-      </w:pPr>
-      <w:r>
-        <w:rPr>
-          <w:noProof/>
-        </w:rPr>
-        <w:t>Schritt 1: Artikel suchen</w:t>
-      </w:r>
-      <w:r>
-        <w:rPr>
-          <w:noProof/>
-        </w:rPr>
-        <w:tab/>
-      </w:r>
-      <w:r>
-        <w:rPr>
-          <w:noProof/>
-        </w:rPr>
-        <w:fldChar w:fldCharType="begin"/>
-      </w:r>
-      <w:r>
-        <w:rPr>
-          <w:noProof/>
-        </w:rPr>
-        <w:instrText xml:space="preserve"> PAGEREF _Toc238900587 \h </w:instrText>
-      </w:r>
-      <w:r>
-        <w:rPr>
-          <w:noProof/>
-        </w:rPr>
-      </w:r>
-      <w:r>
-        <w:rPr>
-          <w:noProof/>
-        </w:rPr>
-        <w:fldChar w:fldCharType="separate"/>
-      </w:r>
-      <w:r>
-        <w:rPr>
-          <w:noProof/>
-        </w:rPr>
-        <w:t>19</w:t>
-      </w:r>
-      <w:r>
-        <w:rPr>
-          <w:noProof/>
-        </w:rPr>
-        <w:fldChar w:fldCharType="end"/>
-      </w:r>
-    </w:p>
-    <w:p>
-      <w:pPr>
-        <w:pStyle w:val="Verzeichnis2"/>
-        <w:tabs>
-          <w:tab w:val="right" w:leader="dot" w:pos="9062"/>
-        </w:tabs>
-        <w:rPr>
-          <w:rFonts w:eastAsiaTheme="minorEastAsia"/>
-          <w:noProof/>
-          <w:lang w:eastAsia="de-DE"/>
-        </w:rPr>
-      </w:pPr>
-      <w:r>
-        <w:rPr>
-          <w:noProof/>
-        </w:rPr>
-        <w:t>Schritt 2: Menge festlegen und in den Warenkorb legen</w:t>
-      </w:r>
-      <w:r>
-        <w:rPr>
-          <w:noProof/>
-        </w:rPr>
-        <w:tab/>
-      </w:r>
-      <w:r>
-        <w:rPr>
-          <w:noProof/>
-        </w:rPr>
-        <w:fldChar w:fldCharType="begin"/>
-      </w:r>
-      <w:r>
-        <w:rPr>
-          <w:noProof/>
-        </w:rPr>
-        <w:instrText xml:space="preserve"> PAGEREF _Toc238900588 \h </w:instrText>
-      </w:r>
-      <w:r>
-        <w:rPr>
-          <w:noProof/>
-        </w:rPr>
-      </w:r>
-      <w:r>
-        <w:rPr>
-          <w:noProof/>
-        </w:rPr>
-        <w:fldChar w:fldCharType="separate"/>
-      </w:r>
-      <w:r>
-        <w:rPr>
-          <w:noProof/>
-        </w:rPr>
-        <w:t>19</w:t>
-      </w:r>
-      <w:r>
-        <w:rPr>
-          <w:noProof/>
-        </w:rPr>
-        <w:fldChar w:fldCharType="end"/>
-      </w:r>
-    </w:p>
-    <w:p>
-      <w:pPr>
-        <w:pStyle w:val="Verzeichnis2"/>
-        <w:tabs>
-          <w:tab w:val="right" w:leader="dot" w:pos="9062"/>
-        </w:tabs>
-        <w:rPr>
-          <w:rFonts w:eastAsiaTheme="minorEastAsia"/>
-          <w:noProof/>
-          <w:lang w:eastAsia="de-DE"/>
-        </w:rPr>
-      </w:pPr>
-      <w:r>
-        <w:rPr>
-          <w:noProof/>
-        </w:rPr>
-        <w:t>Schritt 3: Warenkorb prüfen</w:t>
-      </w:r>
-      <w:r>
-        <w:rPr>
-          <w:noProof/>
-        </w:rPr>
-        <w:tab/>
-      </w:r>
-      <w:r>
-        <w:rPr>
-          <w:noProof/>
-        </w:rPr>
-        <w:fldChar w:fldCharType="begin"/>
-      </w:r>
-      <w:r>
-        <w:rPr>
-          <w:noProof/>
-        </w:rPr>
-        <w:instrText xml:space="preserve"> PAGEREF _Toc238900589 \h </w:instrText>
-      </w:r>
-      <w:r>
-        <w:rPr>
-          <w:noProof/>
-        </w:rPr>
-      </w:r>
-      <w:r>
-        <w:rPr>
-          <w:noProof/>
-        </w:rPr>
-        <w:fldChar w:fldCharType="separate"/>
-      </w:r>
-      <w:r>
-        <w:rPr>
-          <w:noProof/>
-        </w:rPr>
-        <w:t>20</w:t>
-      </w:r>
-      <w:r>
-        <w:rPr>
-          <w:noProof/>
-        </w:rPr>
-        <w:fldChar w:fldCharType="end"/>
-      </w:r>
-    </w:p>
-    <w:p>
-      <w:pPr>
-        <w:pStyle w:val="Verzeichnis2"/>
-        <w:tabs>
-          <w:tab w:val="right" w:leader="dot" w:pos="9062"/>
-        </w:tabs>
-        <w:rPr>
-          <w:rFonts w:eastAsiaTheme="minorEastAsia"/>
-          <w:noProof/>
-          <w:lang w:eastAsia="de-DE"/>
-        </w:rPr>
-      </w:pPr>
-      <w:r>
-        <w:rPr>
-          <w:noProof/>
-        </w:rPr>
-        <w:t>Schritt 4: Zur Bestellübersicht wechseln und Daten eingeben</w:t>
-      </w:r>
-      <w:r>
-        <w:rPr>
-          <w:noProof/>
-        </w:rPr>
-        <w:tab/>
-      </w:r>
-      <w:r>
-        <w:rPr>
-          <w:noProof/>
-        </w:rPr>
-        <w:fldChar w:fldCharType="begin"/>
-      </w:r>
-      <w:r>
-        <w:rPr>
-          <w:noProof/>
-        </w:rPr>
-        <w:instrText xml:space="preserve"> PAGEREF _Toc238900590 \h </w:instrText>
-      </w:r>
-      <w:r>
-        <w:rPr>
-          <w:noProof/>
-        </w:rPr>
-      </w:r>
-      <w:r>
-        <w:rPr>
-          <w:noProof/>
-        </w:rPr>
-        <w:fldChar w:fldCharType="separate"/>
-      </w:r>
-      <w:r>
-        <w:rPr>
-          <w:noProof/>
-        </w:rPr>
-        <w:t>20</w:t>
-      </w:r>
-      <w:r>
-        <w:rPr>
-          <w:noProof/>
-        </w:rPr>
-        <w:fldChar w:fldCharType="end"/>
-      </w:r>
-    </w:p>
-    <w:p>
-      <w:pPr>
-        <w:pStyle w:val="Verzeichnis2"/>
-        <w:tabs>
-          <w:tab w:val="right" w:leader="dot" w:pos="9062"/>
-        </w:tabs>
-        <w:rPr>
-          <w:rFonts w:eastAsiaTheme="minorEastAsia"/>
-          <w:noProof/>
-          <w:lang w:eastAsia="de-DE"/>
-        </w:rPr>
-      </w:pPr>
-      <w:r>
-        <w:rPr>
-          <w:noProof/>
-        </w:rPr>
-        <w:t>Schritt 5: Bestellung abschließen</w:t>
-      </w:r>
-      <w:r>
-        <w:rPr>
-          <w:noProof/>
-        </w:rPr>
-        <w:tab/>
-      </w:r>
-      <w:r>
-        <w:rPr>
-          <w:noProof/>
-        </w:rPr>
-        <w:fldChar w:fldCharType="begin"/>
-      </w:r>
-      <w:r>
-        <w:rPr>
-          <w:noProof/>
-        </w:rPr>
-        <w:instrText xml:space="preserve"> PAGEREF _Toc238900591 \h </w:instrText>
-      </w:r>
-      <w:r>
-        <w:rPr>
-          <w:noProof/>
-        </w:rPr>
-      </w:r>
-      <w:r>
-        <w:rPr>
-          <w:noProof/>
-        </w:rPr>
-        <w:fldChar w:fldCharType="separate"/>
-      </w:r>
-      <w:r>
-        <w:rPr>
-          <w:noProof/>
-        </w:rPr>
-        <w:t>21</w:t>
+        <w:t>15</w:t>
       </w:r>
       <w:r>
         <w:rPr>
@@ -6092,2376 +5612,10 @@
       <w:pPr>
         <w:pStyle w:val="berschrift1"/>
       </w:pPr>
-      <w:bookmarkStart w:id="11" w:name="_Toc238900578"/>
-      <w:r>
-        <w:t>6. Verwaltungsbereich (Admin)</w:t>
-      </w:r>
-      <w:bookmarkEnd w:id="11"/>
-    </w:p>
-    <w:p>
-      <w:r>
-        <w:t>Der Verwaltungsbereich ist über "Daten verwalten" in der Kopfzeile erreichbar und zusätzlich durch ein eigenes Admin-Passwort geschützt, das unabhängig von den Kundenkonten ist.</w:t>
-      </w:r>
-    </w:p>
-    <w:p>
-      <w:pPr>
-        <w:pStyle w:val="berschrift2"/>
-      </w:pPr>
-      <w:bookmarkStart w:id="12" w:name="_Toc238900579"/>
-      <w:r>
-        <w:t>6.1 Admin-Passwort einrichten</w:t>
-      </w:r>
-      <w:bookmarkEnd w:id="12"/>
-    </w:p>
-    <w:p>
-      <w:r>
-        <w:t>Beim allerersten Aufruf ist noch kein Admin-Passwort vergeben; es muss einmalig festgelegt werden.</w:t>
-      </w:r>
-    </w:p>
-    <w:p>
-      <w:pPr>
-        <w:jc w:val="center"/>
-      </w:pPr>
-      <w:r>
-        <w:rPr>
-          <w:noProof/>
-        </w:rPr>
+      <w:bookmarkStart w:id="19" w:name="_Toc238900586"/>
+      <w:r>
         <w:lastRenderedPageBreak/>
-        <w:drawing>
-          <wp:inline distT="0" distB="0" distL="0" distR="0" wp14:anchorId="7925D625" wp14:editId="3B953CAF">
-            <wp:extent cx="5334000" cy="3750616"/>
-            <wp:effectExtent l="0" t="0" r="0" b="2540"/>
-            <wp:docPr id="7" name="Grafik 7"/>
-            <wp:cNvGraphicFramePr/>
-            <a:graphic xmlns:a="http://schemas.openxmlformats.org/drawingml/2006/main">
-              <a:graphicData uri="http://schemas.openxmlformats.org/drawingml/2006/picture">
-                <pic:pic xmlns:pic="http://schemas.openxmlformats.org/drawingml/2006/picture">
-                  <pic:nvPicPr>
-                    <pic:cNvPr id="7" name=""/>
-                    <pic:cNvPicPr/>
-                  </pic:nvPicPr>
-                  <pic:blipFill>
-                    <a:blip r:embed="rId15">
-                      <a:extLst>
-                        <a:ext uri="{28A0092B-C50C-407E-A947-70E740481C1C}">
-                          <a14:useLocalDpi xmlns:a14="http://schemas.microsoft.com/office/drawing/2010/main" val="0"/>
-                        </a:ext>
-                      </a:extLst>
-                    </a:blip>
-                    <a:stretch>
-                      <a:fillRect/>
-                    </a:stretch>
-                  </pic:blipFill>
-                  <pic:spPr>
-                    <a:xfrm>
-                      <a:off x="0" y="0"/>
-                      <a:ext cx="5334000" cy="3750616"/>
-                    </a:xfrm>
-                    <a:prstGeom prst="rect">
-                      <a:avLst/>
-                    </a:prstGeom>
-                  </pic:spPr>
-                </pic:pic>
-              </a:graphicData>
-            </a:graphic>
-          </wp:inline>
-        </w:drawing>
-      </w:r>
-    </w:p>
-    <w:tbl>
-      <w:tblPr>
-        <w:tblW w:w="9080" w:type="dxa"/>
-        <w:tblBorders>
-          <w:top w:val="single" w:sz="4" w:space="0" w:color="auto"/>
-          <w:left w:val="single" w:sz="4" w:space="0" w:color="auto"/>
-          <w:bottom w:val="single" w:sz="4" w:space="0" w:color="auto"/>
-          <w:right w:val="single" w:sz="4" w:space="0" w:color="auto"/>
-          <w:insideH w:val="single" w:sz="4" w:space="0" w:color="auto"/>
-          <w:insideV w:val="single" w:sz="4" w:space="0" w:color="auto"/>
-        </w:tblBorders>
-        <w:tblLayout w:type="fixed"/>
-        <w:tblCellMar>
-          <w:left w:w="70" w:type="dxa"/>
-          <w:right w:w="70" w:type="dxa"/>
-        </w:tblCellMar>
-        <w:tblLook w:val="0000" w:firstRow="0" w:lastRow="0" w:firstColumn="0" w:lastColumn="0" w:noHBand="0" w:noVBand="0"/>
-      </w:tblPr>
-      <w:tblGrid>
-        <w:gridCol w:w="680"/>
-        <w:gridCol w:w="8400"/>
-      </w:tblGrid>
-      <w:tr>
-        <w:trPr>
-          <w:tblHeader/>
-          <w:cantSplit/>
-        </w:trPr>
-        <w:tc>
-          <w:tcPr>
-            <w:tcW w:w="680" w:type="dxa"/>
-            <w:shd w:val="clear" w:color="auto" w:fill="2C5B39"/>
-          </w:tcPr>
-          <w:p>
-            <w:pPr>
-              <w:rPr>
-                <w:b/>
-                <w:color w:val="FFFFFF"/>
-                <w:sz w:val="20"/>
-              </w:rPr>
-            </w:pPr>
-            <w:r>
-              <w:rPr>
-                <w:b/>
-                <w:color w:val="FFFFFF"/>
-                <w:sz w:val="20"/>
-              </w:rPr>
-              <w:t>Nr.</w:t>
-            </w:r>
-          </w:p>
-        </w:tc>
-        <w:tc>
-          <w:tcPr>
-            <w:tcW w:w="8400" w:type="dxa"/>
-            <w:shd w:val="clear" w:color="auto" w:fill="2C5B39"/>
-          </w:tcPr>
-          <w:p>
-            <w:pPr>
-              <w:rPr>
-                <w:b/>
-                <w:color w:val="FFFFFF"/>
-                <w:sz w:val="20"/>
-              </w:rPr>
-            </w:pPr>
-            <w:r>
-              <w:rPr>
-                <w:b/>
-                <w:color w:val="FFFFFF"/>
-                <w:sz w:val="20"/>
-              </w:rPr>
-              <w:t>Element</w:t>
-            </w:r>
-          </w:p>
-        </w:tc>
-      </w:tr>
-      <w:tr>
-        <w:tc>
-          <w:tcPr>
-            <w:tcW w:w="680" w:type="dxa"/>
-            <w:shd w:val="clear" w:color="auto" w:fill="auto"/>
-          </w:tcPr>
-          <w:p>
-            <w:pPr>
-              <w:rPr>
-                <w:sz w:val="20"/>
-              </w:rPr>
-            </w:pPr>
-            <w:r>
-              <w:rPr>
-                <w:sz w:val="20"/>
-              </w:rPr>
-              <w:t>1</w:t>
-            </w:r>
-          </w:p>
-        </w:tc>
-        <w:tc>
-          <w:tcPr>
-            <w:tcW w:w="8400" w:type="dxa"/>
-            <w:shd w:val="clear" w:color="auto" w:fill="auto"/>
-          </w:tcPr>
-          <w:p>
-            <w:pPr>
-              <w:rPr>
-                <w:sz w:val="20"/>
-              </w:rPr>
-            </w:pPr>
-            <w:r>
-              <w:rPr>
-                <w:sz w:val="20"/>
-              </w:rPr>
-              <w:t>Überschrift "Admin-Passwort einrichten".</w:t>
-            </w:r>
-          </w:p>
-        </w:tc>
-      </w:tr>
-      <w:tr>
-        <w:tc>
-          <w:tcPr>
-            <w:tcW w:w="680" w:type="dxa"/>
-            <w:shd w:val="clear" w:color="auto" w:fill="auto"/>
-          </w:tcPr>
-          <w:p>
-            <w:pPr>
-              <w:rPr>
-                <w:sz w:val="20"/>
-              </w:rPr>
-            </w:pPr>
-            <w:r>
-              <w:rPr>
-                <w:sz w:val="20"/>
-              </w:rPr>
-              <w:t>2</w:t>
-            </w:r>
-          </w:p>
-        </w:tc>
-        <w:tc>
-          <w:tcPr>
-            <w:tcW w:w="8400" w:type="dxa"/>
-            <w:shd w:val="clear" w:color="auto" w:fill="auto"/>
-          </w:tcPr>
-          <w:p>
-            <w:pPr>
-              <w:rPr>
-                <w:sz w:val="20"/>
-              </w:rPr>
-            </w:pPr>
-            <w:r>
-              <w:rPr>
-                <w:sz w:val="20"/>
-              </w:rPr>
-              <w:t>Eingabefeld Neues Admin-Passwort (mindestens 6 Zeichen).</w:t>
-            </w:r>
-          </w:p>
-        </w:tc>
-      </w:tr>
-      <w:tr>
-        <w:tc>
-          <w:tcPr>
-            <w:tcW w:w="680" w:type="dxa"/>
-            <w:shd w:val="clear" w:color="auto" w:fill="auto"/>
-          </w:tcPr>
-          <w:p>
-            <w:pPr>
-              <w:rPr>
-                <w:sz w:val="20"/>
-              </w:rPr>
-            </w:pPr>
-            <w:r>
-              <w:rPr>
-                <w:sz w:val="20"/>
-              </w:rPr>
-              <w:t>3</w:t>
-            </w:r>
-          </w:p>
-        </w:tc>
-        <w:tc>
-          <w:tcPr>
-            <w:tcW w:w="8400" w:type="dxa"/>
-            <w:shd w:val="clear" w:color="auto" w:fill="auto"/>
-          </w:tcPr>
-          <w:p>
-            <w:pPr>
-              <w:rPr>
-                <w:sz w:val="20"/>
-              </w:rPr>
-            </w:pPr>
-            <w:r>
-              <w:rPr>
-                <w:sz w:val="20"/>
-              </w:rPr>
-              <w:t>Eingabefeld Wiederholen.</w:t>
-            </w:r>
-          </w:p>
-        </w:tc>
-      </w:tr>
-      <w:tr>
-        <w:tc>
-          <w:tcPr>
-            <w:tcW w:w="680" w:type="dxa"/>
-            <w:shd w:val="clear" w:color="auto" w:fill="auto"/>
-          </w:tcPr>
-          <w:p>
-            <w:pPr>
-              <w:rPr>
-                <w:sz w:val="20"/>
-              </w:rPr>
-            </w:pPr>
-            <w:r>
-              <w:rPr>
-                <w:sz w:val="20"/>
-              </w:rPr>
-              <w:t>4</w:t>
-            </w:r>
-          </w:p>
-        </w:tc>
-        <w:tc>
-          <w:tcPr>
-            <w:tcW w:w="8400" w:type="dxa"/>
-            <w:shd w:val="clear" w:color="auto" w:fill="auto"/>
-          </w:tcPr>
-          <w:p>
-            <w:pPr>
-              <w:rPr>
-                <w:sz w:val="20"/>
-              </w:rPr>
-            </w:pPr>
-            <w:r>
-              <w:rPr>
-                <w:sz w:val="20"/>
-              </w:rPr>
-              <w:t>Button "Passwort festlegen" - legt das Passwort fest und schaltet die Verwaltung frei.</w:t>
-            </w:r>
-          </w:p>
-        </w:tc>
-      </w:tr>
-    </w:tbl>
-    <w:p/>
-    <w:p>
-      <w:pPr>
-        <w:pStyle w:val="berschrift2"/>
-      </w:pPr>
-      <w:bookmarkStart w:id="13" w:name="_Toc238900580"/>
-      <w:r>
-        <w:t>6.2 Verwaltungsbereich gesperrt</w:t>
-      </w:r>
-      <w:bookmarkEnd w:id="13"/>
-    </w:p>
-    <w:p>
-      <w:r>
-        <w:t>Ist bereits ein Admin-Passwort vergeben, muss es bei jedem neuen Besuch erneut eingegeben werden (die Entsperrung gilt nur für die aktuelle Browser-Sitzung).</w:t>
-      </w:r>
-    </w:p>
-    <w:p>
-      <w:pPr>
-        <w:jc w:val="center"/>
-      </w:pPr>
-      <w:r>
-        <w:rPr>
-          <w:noProof/>
-        </w:rPr>
-        <w:lastRenderedPageBreak/>
-        <w:drawing>
-          <wp:inline distT="0" distB="0" distL="0" distR="0" wp14:anchorId="6745C722" wp14:editId="7AF56114">
-            <wp:extent cx="5334000" cy="3750616"/>
-            <wp:effectExtent l="0" t="0" r="0" b="2540"/>
-            <wp:docPr id="8" name="Grafik 8"/>
-            <wp:cNvGraphicFramePr/>
-            <a:graphic xmlns:a="http://schemas.openxmlformats.org/drawingml/2006/main">
-              <a:graphicData uri="http://schemas.openxmlformats.org/drawingml/2006/picture">
-                <pic:pic xmlns:pic="http://schemas.openxmlformats.org/drawingml/2006/picture">
-                  <pic:nvPicPr>
-                    <pic:cNvPr id="8" name=""/>
-                    <pic:cNvPicPr/>
-                  </pic:nvPicPr>
-                  <pic:blipFill>
-                    <a:blip r:embed="rId16">
-                      <a:extLst>
-                        <a:ext uri="{28A0092B-C50C-407E-A947-70E740481C1C}">
-                          <a14:useLocalDpi xmlns:a14="http://schemas.microsoft.com/office/drawing/2010/main" val="0"/>
-                        </a:ext>
-                      </a:extLst>
-                    </a:blip>
-                    <a:stretch>
-                      <a:fillRect/>
-                    </a:stretch>
-                  </pic:blipFill>
-                  <pic:spPr>
-                    <a:xfrm>
-                      <a:off x="0" y="0"/>
-                      <a:ext cx="5334000" cy="3750616"/>
-                    </a:xfrm>
-                    <a:prstGeom prst="rect">
-                      <a:avLst/>
-                    </a:prstGeom>
-                  </pic:spPr>
-                </pic:pic>
-              </a:graphicData>
-            </a:graphic>
-          </wp:inline>
-        </w:drawing>
-      </w:r>
-    </w:p>
-    <w:tbl>
-      <w:tblPr>
-        <w:tblW w:w="9080" w:type="dxa"/>
-        <w:tblBorders>
-          <w:top w:val="single" w:sz="4" w:space="0" w:color="auto"/>
-          <w:left w:val="single" w:sz="4" w:space="0" w:color="auto"/>
-          <w:bottom w:val="single" w:sz="4" w:space="0" w:color="auto"/>
-          <w:right w:val="single" w:sz="4" w:space="0" w:color="auto"/>
-          <w:insideH w:val="single" w:sz="4" w:space="0" w:color="auto"/>
-          <w:insideV w:val="single" w:sz="4" w:space="0" w:color="auto"/>
-        </w:tblBorders>
-        <w:tblLayout w:type="fixed"/>
-        <w:tblCellMar>
-          <w:left w:w="70" w:type="dxa"/>
-          <w:right w:w="70" w:type="dxa"/>
-        </w:tblCellMar>
-        <w:tblLook w:val="0000" w:firstRow="0" w:lastRow="0" w:firstColumn="0" w:lastColumn="0" w:noHBand="0" w:noVBand="0"/>
-      </w:tblPr>
-      <w:tblGrid>
-        <w:gridCol w:w="680"/>
-        <w:gridCol w:w="8400"/>
-      </w:tblGrid>
-      <w:tr>
-        <w:trPr>
-          <w:tblHeader/>
-          <w:cantSplit/>
-        </w:trPr>
-        <w:tc>
-          <w:tcPr>
-            <w:tcW w:w="680" w:type="dxa"/>
-            <w:shd w:val="clear" w:color="auto" w:fill="2C5B39"/>
-          </w:tcPr>
-          <w:p>
-            <w:pPr>
-              <w:rPr>
-                <w:b/>
-                <w:color w:val="FFFFFF"/>
-                <w:sz w:val="20"/>
-              </w:rPr>
-            </w:pPr>
-            <w:r>
-              <w:rPr>
-                <w:b/>
-                <w:color w:val="FFFFFF"/>
-                <w:sz w:val="20"/>
-              </w:rPr>
-              <w:t>Nr.</w:t>
-            </w:r>
-          </w:p>
-        </w:tc>
-        <w:tc>
-          <w:tcPr>
-            <w:tcW w:w="8400" w:type="dxa"/>
-            <w:shd w:val="clear" w:color="auto" w:fill="2C5B39"/>
-          </w:tcPr>
-          <w:p>
-            <w:pPr>
-              <w:rPr>
-                <w:b/>
-                <w:color w:val="FFFFFF"/>
-                <w:sz w:val="20"/>
-              </w:rPr>
-            </w:pPr>
-            <w:r>
-              <w:rPr>
-                <w:b/>
-                <w:color w:val="FFFFFF"/>
-                <w:sz w:val="20"/>
-              </w:rPr>
-              <w:t>Element</w:t>
-            </w:r>
-          </w:p>
-        </w:tc>
-      </w:tr>
-      <w:tr>
-        <w:tc>
-          <w:tcPr>
-            <w:tcW w:w="680" w:type="dxa"/>
-            <w:shd w:val="clear" w:color="auto" w:fill="auto"/>
-          </w:tcPr>
-          <w:p>
-            <w:pPr>
-              <w:rPr>
-                <w:sz w:val="20"/>
-              </w:rPr>
-            </w:pPr>
-            <w:r>
-              <w:rPr>
-                <w:sz w:val="20"/>
-              </w:rPr>
-              <w:t>1</w:t>
-            </w:r>
-          </w:p>
-        </w:tc>
-        <w:tc>
-          <w:tcPr>
-            <w:tcW w:w="8400" w:type="dxa"/>
-            <w:shd w:val="clear" w:color="auto" w:fill="auto"/>
-          </w:tcPr>
-          <w:p>
-            <w:pPr>
-              <w:rPr>
-                <w:sz w:val="20"/>
-              </w:rPr>
-            </w:pPr>
-            <w:r>
-              <w:rPr>
-                <w:sz w:val="20"/>
-              </w:rPr>
-              <w:t>Überschrift "Verwaltungsbereich gesperrt".</w:t>
-            </w:r>
-          </w:p>
-        </w:tc>
-      </w:tr>
-      <w:tr>
-        <w:tc>
-          <w:tcPr>
-            <w:tcW w:w="680" w:type="dxa"/>
-            <w:shd w:val="clear" w:color="auto" w:fill="auto"/>
-          </w:tcPr>
-          <w:p>
-            <w:pPr>
-              <w:rPr>
-                <w:sz w:val="20"/>
-              </w:rPr>
-            </w:pPr>
-            <w:r>
-              <w:rPr>
-                <w:sz w:val="20"/>
-              </w:rPr>
-              <w:t>2</w:t>
-            </w:r>
-          </w:p>
-        </w:tc>
-        <w:tc>
-          <w:tcPr>
-            <w:tcW w:w="8400" w:type="dxa"/>
-            <w:shd w:val="clear" w:color="auto" w:fill="auto"/>
-          </w:tcPr>
-          <w:p>
-            <w:pPr>
-              <w:rPr>
-                <w:sz w:val="20"/>
-              </w:rPr>
-            </w:pPr>
-            <w:r>
-              <w:rPr>
-                <w:sz w:val="20"/>
-              </w:rPr>
-              <w:t>Eingabefeld Admin-Passwort.</w:t>
-            </w:r>
-          </w:p>
-        </w:tc>
-      </w:tr>
-      <w:tr>
-        <w:tc>
-          <w:tcPr>
-            <w:tcW w:w="680" w:type="dxa"/>
-            <w:shd w:val="clear" w:color="auto" w:fill="auto"/>
-          </w:tcPr>
-          <w:p>
-            <w:pPr>
-              <w:rPr>
-                <w:sz w:val="20"/>
-              </w:rPr>
-            </w:pPr>
-            <w:r>
-              <w:rPr>
-                <w:sz w:val="20"/>
-              </w:rPr>
-              <w:t>3</w:t>
-            </w:r>
-          </w:p>
-        </w:tc>
-        <w:tc>
-          <w:tcPr>
-            <w:tcW w:w="8400" w:type="dxa"/>
-            <w:shd w:val="clear" w:color="auto" w:fill="auto"/>
-          </w:tcPr>
-          <w:p>
-            <w:pPr>
-              <w:rPr>
-                <w:sz w:val="20"/>
-              </w:rPr>
-            </w:pPr>
-            <w:r>
-              <w:rPr>
-                <w:sz w:val="20"/>
-              </w:rPr>
-              <w:t>Button "Entsperren".</w:t>
-            </w:r>
-          </w:p>
-        </w:tc>
-      </w:tr>
-    </w:tbl>
-    <w:p/>
-    <w:p>
-      <w:pPr>
-        <w:pStyle w:val="berschrift2"/>
-      </w:pPr>
-      <w:bookmarkStart w:id="14" w:name="_Toc238900581"/>
-      <w:r>
-        <w:lastRenderedPageBreak/>
-        <w:t>6.3 Status</w:t>
-      </w:r>
-      <w:bookmarkEnd w:id="14"/>
-    </w:p>
-    <w:p>
-      <w:pPr>
-        <w:jc w:val="center"/>
-      </w:pPr>
-      <w:r>
-        <w:rPr>
-          <w:noProof/>
-        </w:rPr>
-        <w:drawing>
-          <wp:inline distT="0" distB="0" distL="0" distR="0" wp14:anchorId="329A3487" wp14:editId="60DDE70C">
-            <wp:extent cx="5334000" cy="3750616"/>
-            <wp:effectExtent l="0" t="0" r="0" b="2540"/>
-            <wp:docPr id="9" name="Grafik 9"/>
-            <wp:cNvGraphicFramePr/>
-            <a:graphic xmlns:a="http://schemas.openxmlformats.org/drawingml/2006/main">
-              <a:graphicData uri="http://schemas.openxmlformats.org/drawingml/2006/picture">
-                <pic:pic xmlns:pic="http://schemas.openxmlformats.org/drawingml/2006/picture">
-                  <pic:nvPicPr>
-                    <pic:cNvPr id="9" name=""/>
-                    <pic:cNvPicPr/>
-                  </pic:nvPicPr>
-                  <pic:blipFill>
-                    <a:blip r:embed="rId17">
-                      <a:extLst>
-                        <a:ext uri="{28A0092B-C50C-407E-A947-70E740481C1C}">
-                          <a14:useLocalDpi xmlns:a14="http://schemas.microsoft.com/office/drawing/2010/main" val="0"/>
-                        </a:ext>
-                      </a:extLst>
-                    </a:blip>
-                    <a:stretch>
-                      <a:fillRect/>
-                    </a:stretch>
-                  </pic:blipFill>
-                  <pic:spPr>
-                    <a:xfrm>
-                      <a:off x="0" y="0"/>
-                      <a:ext cx="5334000" cy="3750616"/>
-                    </a:xfrm>
-                    <a:prstGeom prst="rect">
-                      <a:avLst/>
-                    </a:prstGeom>
-                  </pic:spPr>
-                </pic:pic>
-              </a:graphicData>
-            </a:graphic>
-          </wp:inline>
-        </w:drawing>
-      </w:r>
-    </w:p>
-    <w:tbl>
-      <w:tblPr>
-        <w:tblW w:w="9080" w:type="dxa"/>
-        <w:tblBorders>
-          <w:top w:val="single" w:sz="4" w:space="0" w:color="auto"/>
-          <w:left w:val="single" w:sz="4" w:space="0" w:color="auto"/>
-          <w:bottom w:val="single" w:sz="4" w:space="0" w:color="auto"/>
-          <w:right w:val="single" w:sz="4" w:space="0" w:color="auto"/>
-          <w:insideH w:val="single" w:sz="4" w:space="0" w:color="auto"/>
-          <w:insideV w:val="single" w:sz="4" w:space="0" w:color="auto"/>
-        </w:tblBorders>
-        <w:tblLayout w:type="fixed"/>
-        <w:tblCellMar>
-          <w:left w:w="70" w:type="dxa"/>
-          <w:right w:w="70" w:type="dxa"/>
-        </w:tblCellMar>
-        <w:tblLook w:val="0000" w:firstRow="0" w:lastRow="0" w:firstColumn="0" w:lastColumn="0" w:noHBand="0" w:noVBand="0"/>
-      </w:tblPr>
-      <w:tblGrid>
-        <w:gridCol w:w="680"/>
-        <w:gridCol w:w="8400"/>
-      </w:tblGrid>
-      <w:tr>
-        <w:trPr>
-          <w:tblHeader/>
-          <w:cantSplit/>
-        </w:trPr>
-        <w:tc>
-          <w:tcPr>
-            <w:tcW w:w="680" w:type="dxa"/>
-            <w:shd w:val="clear" w:color="auto" w:fill="2C5B39"/>
-          </w:tcPr>
-          <w:p>
-            <w:pPr>
-              <w:rPr>
-                <w:b/>
-                <w:color w:val="FFFFFF"/>
-                <w:sz w:val="20"/>
-              </w:rPr>
-            </w:pPr>
-            <w:r>
-              <w:rPr>
-                <w:b/>
-                <w:color w:val="FFFFFF"/>
-                <w:sz w:val="20"/>
-              </w:rPr>
-              <w:t>Nr.</w:t>
-            </w:r>
-          </w:p>
-        </w:tc>
-        <w:tc>
-          <w:tcPr>
-            <w:tcW w:w="8400" w:type="dxa"/>
-            <w:shd w:val="clear" w:color="auto" w:fill="2C5B39"/>
-          </w:tcPr>
-          <w:p>
-            <w:pPr>
-              <w:rPr>
-                <w:b/>
-                <w:color w:val="FFFFFF"/>
-                <w:sz w:val="20"/>
-              </w:rPr>
-            </w:pPr>
-            <w:r>
-              <w:rPr>
-                <w:b/>
-                <w:color w:val="FFFFFF"/>
-                <w:sz w:val="20"/>
-              </w:rPr>
-              <w:t>Element</w:t>
-            </w:r>
-          </w:p>
-        </w:tc>
-      </w:tr>
-      <w:tr>
-        <w:tc>
-          <w:tcPr>
-            <w:tcW w:w="680" w:type="dxa"/>
-            <w:shd w:val="clear" w:color="auto" w:fill="auto"/>
-          </w:tcPr>
-          <w:p>
-            <w:pPr>
-              <w:rPr>
-                <w:sz w:val="20"/>
-              </w:rPr>
-            </w:pPr>
-            <w:r>
-              <w:rPr>
-                <w:sz w:val="20"/>
-              </w:rPr>
-              <w:t>1</w:t>
-            </w:r>
-          </w:p>
-        </w:tc>
-        <w:tc>
-          <w:tcPr>
-            <w:tcW w:w="8400" w:type="dxa"/>
-            <w:shd w:val="clear" w:color="auto" w:fill="auto"/>
-          </w:tcPr>
-          <w:p>
-            <w:pPr>
-              <w:rPr>
-                <w:sz w:val="20"/>
-              </w:rPr>
-            </w:pPr>
-            <w:r>
-              <w:rPr>
-                <w:sz w:val="20"/>
-              </w:rPr>
-              <w:t>Anzahl der Artikel im gesamten Produktkatalog.</w:t>
-            </w:r>
-          </w:p>
-        </w:tc>
-      </w:tr>
-      <w:tr>
-        <w:tc>
-          <w:tcPr>
-            <w:tcW w:w="680" w:type="dxa"/>
-            <w:shd w:val="clear" w:color="auto" w:fill="auto"/>
-          </w:tcPr>
-          <w:p>
-            <w:pPr>
-              <w:rPr>
-                <w:sz w:val="20"/>
-              </w:rPr>
-            </w:pPr>
-            <w:r>
-              <w:rPr>
-                <w:sz w:val="20"/>
-              </w:rPr>
-              <w:t>2</w:t>
-            </w:r>
-          </w:p>
-        </w:tc>
-        <w:tc>
-          <w:tcPr>
-            <w:tcW w:w="8400" w:type="dxa"/>
-            <w:shd w:val="clear" w:color="auto" w:fill="auto"/>
-          </w:tcPr>
-          <w:p>
-            <w:pPr>
-              <w:rPr>
-                <w:sz w:val="20"/>
-              </w:rPr>
-            </w:pPr>
-            <w:r>
-              <w:rPr>
-                <w:sz w:val="20"/>
-              </w:rPr>
-              <w:t>Anzahl der Kategorien.</w:t>
-            </w:r>
-          </w:p>
-        </w:tc>
-      </w:tr>
-      <w:tr>
-        <w:tc>
-          <w:tcPr>
-            <w:tcW w:w="680" w:type="dxa"/>
-            <w:shd w:val="clear" w:color="auto" w:fill="auto"/>
-          </w:tcPr>
-          <w:p>
-            <w:pPr>
-              <w:rPr>
-                <w:sz w:val="20"/>
-              </w:rPr>
-            </w:pPr>
-            <w:r>
-              <w:rPr>
-                <w:sz w:val="20"/>
-              </w:rPr>
-              <w:t>3</w:t>
-            </w:r>
-          </w:p>
-        </w:tc>
-        <w:tc>
-          <w:tcPr>
-            <w:tcW w:w="8400" w:type="dxa"/>
-            <w:shd w:val="clear" w:color="auto" w:fill="auto"/>
-          </w:tcPr>
-          <w:p>
-            <w:pPr>
-              <w:rPr>
-                <w:sz w:val="20"/>
-              </w:rPr>
-            </w:pPr>
-            <w:r>
-              <w:rPr>
-                <w:sz w:val="20"/>
-              </w:rPr>
-              <w:t>Anzahl der Kundenkonten, die auf diesem Gerät registriert wurden.</w:t>
-            </w:r>
-          </w:p>
-        </w:tc>
-      </w:tr>
-      <w:tr>
-        <w:tc>
-          <w:tcPr>
-            <w:tcW w:w="680" w:type="dxa"/>
-            <w:shd w:val="clear" w:color="auto" w:fill="auto"/>
-          </w:tcPr>
-          <w:p>
-            <w:pPr>
-              <w:rPr>
-                <w:sz w:val="20"/>
-              </w:rPr>
-            </w:pPr>
-            <w:r>
-              <w:rPr>
-                <w:sz w:val="20"/>
-              </w:rPr>
-              <w:t>4</w:t>
-            </w:r>
-          </w:p>
-        </w:tc>
-        <w:tc>
-          <w:tcPr>
-            <w:tcW w:w="8400" w:type="dxa"/>
-            <w:shd w:val="clear" w:color="auto" w:fill="auto"/>
-          </w:tcPr>
-          <w:p>
-            <w:pPr>
-              <w:rPr>
-                <w:sz w:val="20"/>
-              </w:rPr>
-            </w:pPr>
-            <w:r>
-              <w:rPr>
-                <w:sz w:val="20"/>
-              </w:rPr>
-              <w:t>Zeitpunkt der letzten Aktualisierung eines Katalogteils.</w:t>
-            </w:r>
-          </w:p>
-        </w:tc>
-      </w:tr>
-      <w:tr>
-        <w:tc>
-          <w:tcPr>
-            <w:tcW w:w="680" w:type="dxa"/>
-            <w:shd w:val="clear" w:color="auto" w:fill="auto"/>
-          </w:tcPr>
-          <w:p>
-            <w:pPr>
-              <w:rPr>
-                <w:sz w:val="20"/>
-              </w:rPr>
-            </w:pPr>
-            <w:r>
-              <w:rPr>
-                <w:sz w:val="20"/>
-              </w:rPr>
-              <w:t>5</w:t>
-            </w:r>
-          </w:p>
-        </w:tc>
-        <w:tc>
-          <w:tcPr>
-            <w:tcW w:w="8400" w:type="dxa"/>
-            <w:shd w:val="clear" w:color="auto" w:fill="auto"/>
-          </w:tcPr>
-          <w:p>
-            <w:pPr>
-              <w:rPr>
-                <w:sz w:val="20"/>
-              </w:rPr>
-            </w:pPr>
-            <w:r>
-              <w:rPr>
-                <w:sz w:val="20"/>
-              </w:rPr>
-              <w:t>Button "Verwaltung sperren" - sperrt den Admin-Bereich wieder sofort.</w:t>
-            </w:r>
-          </w:p>
-        </w:tc>
-      </w:tr>
-    </w:tbl>
-    <w:p/>
-    <w:p>
-      <w:pPr>
-        <w:pStyle w:val="berschrift2"/>
-      </w:pPr>
-      <w:bookmarkStart w:id="15" w:name="_Toc238900582"/>
-      <w:r>
-        <w:t>6.4 Produktkatalog je Kategorie</w:t>
-      </w:r>
-      <w:bookmarkEnd w:id="15"/>
-    </w:p>
-    <w:p>
-      <w:r>
-        <w:t>Für jede der 5 Kategorien gibt es eine eigene Zeile. Ein Upload zeigt zunächst nur eine lokale Vorschau im eigenen Browser; erst der Export der Datei und das Ersetzen im Hosting macht die Änderung für alle Mitglieder sichtbar.</w:t>
-      </w:r>
-    </w:p>
-    <w:p>
-      <w:pPr>
-        <w:jc w:val="center"/>
-      </w:pPr>
-      <w:r>
-        <w:rPr>
-          <w:noProof/>
-        </w:rPr>
-        <w:lastRenderedPageBreak/>
-        <w:drawing>
-          <wp:inline distT="0" distB="0" distL="0" distR="0" wp14:anchorId="3BF5A68E" wp14:editId="5A035E57">
-            <wp:extent cx="5334000" cy="3541889"/>
-            <wp:effectExtent l="0" t="0" r="0" b="1905"/>
-            <wp:docPr id="10" name="Grafik 10"/>
-            <wp:cNvGraphicFramePr/>
-            <a:graphic xmlns:a="http://schemas.openxmlformats.org/drawingml/2006/main">
-              <a:graphicData uri="http://schemas.openxmlformats.org/drawingml/2006/picture">
-                <pic:pic xmlns:pic="http://schemas.openxmlformats.org/drawingml/2006/picture">
-                  <pic:nvPicPr>
-                    <pic:cNvPr id="10" name=""/>
-                    <pic:cNvPicPr/>
-                  </pic:nvPicPr>
-                  <pic:blipFill>
-                    <a:blip r:embed="rId18">
-                      <a:extLst>
-                        <a:ext uri="{28A0092B-C50C-407E-A947-70E740481C1C}">
-                          <a14:useLocalDpi xmlns:a14="http://schemas.microsoft.com/office/drawing/2010/main" val="0"/>
-                        </a:ext>
-                      </a:extLst>
-                    </a:blip>
-                    <a:stretch>
-                      <a:fillRect/>
-                    </a:stretch>
-                  </pic:blipFill>
-                  <pic:spPr>
-                    <a:xfrm>
-                      <a:off x="0" y="0"/>
-                      <a:ext cx="5334000" cy="3541889"/>
-                    </a:xfrm>
-                    <a:prstGeom prst="rect">
-                      <a:avLst/>
-                    </a:prstGeom>
-                  </pic:spPr>
-                </pic:pic>
-              </a:graphicData>
-            </a:graphic>
-          </wp:inline>
-        </w:drawing>
-      </w:r>
-    </w:p>
-    <w:tbl>
-      <w:tblPr>
-        <w:tblW w:w="9080" w:type="dxa"/>
-        <w:tblBorders>
-          <w:top w:val="single" w:sz="4" w:space="0" w:color="auto"/>
-          <w:left w:val="single" w:sz="4" w:space="0" w:color="auto"/>
-          <w:bottom w:val="single" w:sz="4" w:space="0" w:color="auto"/>
-          <w:right w:val="single" w:sz="4" w:space="0" w:color="auto"/>
-          <w:insideH w:val="single" w:sz="4" w:space="0" w:color="auto"/>
-          <w:insideV w:val="single" w:sz="4" w:space="0" w:color="auto"/>
-        </w:tblBorders>
-        <w:tblLayout w:type="fixed"/>
-        <w:tblCellMar>
-          <w:left w:w="70" w:type="dxa"/>
-          <w:right w:w="70" w:type="dxa"/>
-        </w:tblCellMar>
-        <w:tblLook w:val="0000" w:firstRow="0" w:lastRow="0" w:firstColumn="0" w:lastColumn="0" w:noHBand="0" w:noVBand="0"/>
-      </w:tblPr>
-      <w:tblGrid>
-        <w:gridCol w:w="680"/>
-        <w:gridCol w:w="8400"/>
-      </w:tblGrid>
-      <w:tr>
-        <w:trPr>
-          <w:tblHeader/>
-          <w:cantSplit/>
-        </w:trPr>
-        <w:tc>
-          <w:tcPr>
-            <w:tcW w:w="680" w:type="dxa"/>
-            <w:shd w:val="clear" w:color="auto" w:fill="2C5B39"/>
-          </w:tcPr>
-          <w:p>
-            <w:pPr>
-              <w:rPr>
-                <w:b/>
-                <w:color w:val="FFFFFF"/>
-                <w:sz w:val="20"/>
-              </w:rPr>
-            </w:pPr>
-            <w:r>
-              <w:rPr>
-                <w:b/>
-                <w:color w:val="FFFFFF"/>
-                <w:sz w:val="20"/>
-              </w:rPr>
-              <w:t>Nr.</w:t>
-            </w:r>
-          </w:p>
-        </w:tc>
-        <w:tc>
-          <w:tcPr>
-            <w:tcW w:w="8400" w:type="dxa"/>
-            <w:shd w:val="clear" w:color="auto" w:fill="2C5B39"/>
-          </w:tcPr>
-          <w:p>
-            <w:pPr>
-              <w:rPr>
-                <w:b/>
-                <w:color w:val="FFFFFF"/>
-                <w:sz w:val="20"/>
-              </w:rPr>
-            </w:pPr>
-            <w:r>
-              <w:rPr>
-                <w:b/>
-                <w:color w:val="FFFFFF"/>
-                <w:sz w:val="20"/>
-              </w:rPr>
-              <w:t>Element</w:t>
-            </w:r>
-          </w:p>
-        </w:tc>
-      </w:tr>
-      <w:tr>
-        <w:tc>
-          <w:tcPr>
-            <w:tcW w:w="680" w:type="dxa"/>
-            <w:shd w:val="clear" w:color="auto" w:fill="auto"/>
-          </w:tcPr>
-          <w:p>
-            <w:pPr>
-              <w:rPr>
-                <w:sz w:val="20"/>
-              </w:rPr>
-            </w:pPr>
-            <w:r>
-              <w:rPr>
-                <w:sz w:val="20"/>
-              </w:rPr>
-              <w:t>1</w:t>
-            </w:r>
-          </w:p>
-        </w:tc>
-        <w:tc>
-          <w:tcPr>
-            <w:tcW w:w="8400" w:type="dxa"/>
-            <w:shd w:val="clear" w:color="auto" w:fill="auto"/>
-          </w:tcPr>
-          <w:p>
-            <w:pPr>
-              <w:rPr>
-                <w:sz w:val="20"/>
-              </w:rPr>
-            </w:pPr>
-            <w:r>
-              <w:rPr>
-                <w:sz w:val="20"/>
-              </w:rPr>
-              <w:t>Kategoriename und aktuelle Artikelanzahl.</w:t>
-            </w:r>
-          </w:p>
-        </w:tc>
-      </w:tr>
-      <w:tr>
-        <w:tc>
-          <w:tcPr>
-            <w:tcW w:w="680" w:type="dxa"/>
-            <w:shd w:val="clear" w:color="auto" w:fill="auto"/>
-          </w:tcPr>
-          <w:p>
-            <w:pPr>
-              <w:rPr>
-                <w:sz w:val="20"/>
-              </w:rPr>
-            </w:pPr>
-            <w:r>
-              <w:rPr>
-                <w:sz w:val="20"/>
-              </w:rPr>
-              <w:t>2</w:t>
-            </w:r>
-          </w:p>
-        </w:tc>
-        <w:tc>
-          <w:tcPr>
-            <w:tcW w:w="8400" w:type="dxa"/>
-            <w:shd w:val="clear" w:color="auto" w:fill="auto"/>
-          </w:tcPr>
-          <w:p>
-            <w:pPr>
-              <w:rPr>
-                <w:sz w:val="20"/>
-              </w:rPr>
-            </w:pPr>
-            <w:r>
-              <w:rPr>
-                <w:sz w:val="20"/>
-              </w:rPr>
-              <w:t>Datenquelle: "Vom Server geladen", "Nur lokale Vorschau" oder "Bodan-Originaldaten".</w:t>
-            </w:r>
-          </w:p>
-        </w:tc>
-      </w:tr>
-      <w:tr>
-        <w:tc>
-          <w:tcPr>
-            <w:tcW w:w="680" w:type="dxa"/>
-            <w:shd w:val="clear" w:color="auto" w:fill="auto"/>
-          </w:tcPr>
-          <w:p>
-            <w:pPr>
-              <w:rPr>
-                <w:sz w:val="20"/>
-              </w:rPr>
-            </w:pPr>
-            <w:r>
-              <w:rPr>
-                <w:sz w:val="20"/>
-              </w:rPr>
-              <w:t>3</w:t>
-            </w:r>
-          </w:p>
-        </w:tc>
-        <w:tc>
-          <w:tcPr>
-            <w:tcW w:w="8400" w:type="dxa"/>
-            <w:shd w:val="clear" w:color="auto" w:fill="auto"/>
-          </w:tcPr>
-          <w:p>
-            <w:pPr>
-              <w:rPr>
-                <w:sz w:val="20"/>
-              </w:rPr>
-            </w:pPr>
-            <w:r>
-              <w:rPr>
-                <w:sz w:val="20"/>
-              </w:rPr>
-              <w:t>Pfad der zugehörigen Server-Datei (data/*.csv).</w:t>
-            </w:r>
-          </w:p>
-        </w:tc>
-      </w:tr>
-      <w:tr>
-        <w:tc>
-          <w:tcPr>
-            <w:tcW w:w="680" w:type="dxa"/>
-            <w:shd w:val="clear" w:color="auto" w:fill="auto"/>
-          </w:tcPr>
-          <w:p>
-            <w:pPr>
-              <w:rPr>
-                <w:sz w:val="20"/>
-              </w:rPr>
-            </w:pPr>
-            <w:r>
-              <w:rPr>
-                <w:sz w:val="20"/>
-              </w:rPr>
-              <w:t>4</w:t>
-            </w:r>
-          </w:p>
-        </w:tc>
-        <w:tc>
-          <w:tcPr>
-            <w:tcW w:w="8400" w:type="dxa"/>
-            <w:shd w:val="clear" w:color="auto" w:fill="auto"/>
-          </w:tcPr>
-          <w:p>
-            <w:pPr>
-              <w:rPr>
-                <w:sz w:val="20"/>
-              </w:rPr>
-            </w:pPr>
-            <w:r>
-              <w:rPr>
-                <w:sz w:val="20"/>
-              </w:rPr>
-              <w:t>Button "Hochladen (Vorschau)" - lädt eine CSV-Datei hoch und ersetzt die Kategorie lokal.</w:t>
-            </w:r>
-          </w:p>
-        </w:tc>
-      </w:tr>
-      <w:tr>
-        <w:tc>
-          <w:tcPr>
-            <w:tcW w:w="680" w:type="dxa"/>
-            <w:shd w:val="clear" w:color="auto" w:fill="auto"/>
-          </w:tcPr>
-          <w:p>
-            <w:pPr>
-              <w:rPr>
-                <w:sz w:val="20"/>
-              </w:rPr>
-            </w:pPr>
-            <w:r>
-              <w:rPr>
-                <w:sz w:val="20"/>
-              </w:rPr>
-              <w:t>5</w:t>
-            </w:r>
-          </w:p>
-        </w:tc>
-        <w:tc>
-          <w:tcPr>
-            <w:tcW w:w="8400" w:type="dxa"/>
-            <w:shd w:val="clear" w:color="auto" w:fill="auto"/>
-          </w:tcPr>
-          <w:p>
-            <w:pPr>
-              <w:rPr>
-                <w:sz w:val="20"/>
-              </w:rPr>
-            </w:pPr>
-            <w:r>
-              <w:rPr>
-                <w:sz w:val="20"/>
-              </w:rPr>
-              <w:t>Button "Exportieren" - lädt die aktuellen Daten der Kategorie als CSV herunter.</w:t>
-            </w:r>
-          </w:p>
-        </w:tc>
-      </w:tr>
-      <w:tr>
-        <w:tc>
-          <w:tcPr>
-            <w:tcW w:w="680" w:type="dxa"/>
-            <w:shd w:val="clear" w:color="auto" w:fill="auto"/>
-          </w:tcPr>
-          <w:p>
-            <w:pPr>
-              <w:rPr>
-                <w:sz w:val="20"/>
-              </w:rPr>
-            </w:pPr>
-            <w:r>
-              <w:rPr>
-                <w:sz w:val="20"/>
-              </w:rPr>
-              <w:t>6</w:t>
-            </w:r>
-          </w:p>
-        </w:tc>
-        <w:tc>
-          <w:tcPr>
-            <w:tcW w:w="8400" w:type="dxa"/>
-            <w:shd w:val="clear" w:color="auto" w:fill="auto"/>
-          </w:tcPr>
-          <w:p>
-            <w:pPr>
-              <w:rPr>
-                <w:sz w:val="20"/>
-              </w:rPr>
-            </w:pPr>
-            <w:r>
-              <w:rPr>
-                <w:sz w:val="20"/>
-              </w:rPr>
-              <w:t>Button "Alle Kategorien vom Server neu laden" - verwirft lokale Vorschauen und lädt den veröffentlichten Stand.</w:t>
-            </w:r>
-          </w:p>
-        </w:tc>
-      </w:tr>
-    </w:tbl>
-    <w:p/>
-    <w:p>
-      <w:pPr>
-        <w:pStyle w:val="berschrift2"/>
-      </w:pPr>
-      <w:bookmarkStart w:id="16" w:name="_Toc238900583"/>
-      <w:r>
-        <w:t>6.5 Prozentzuschläge</w:t>
-      </w:r>
-      <w:bookmarkEnd w:id="16"/>
-    </w:p>
-    <w:p>
-      <w:r>
-        <w:t>Der Zuschlag der Einkaufsgemeinschaft (Rücklage, Bankkosten, Fahrtkosten usw.) wird auf den Bodan-Preis inklusive MwSt. aufgeschlagen und ergibt den Verkaufspreis. Für Kunden ist er nie einzeln sichtbar.</w:t>
-      </w:r>
-    </w:p>
-    <w:p>
-      <w:pPr>
-        <w:jc w:val="center"/>
-      </w:pPr>
-      <w:r>
-        <w:rPr>
-          <w:noProof/>
-        </w:rPr>
-        <w:lastRenderedPageBreak/>
-        <w:drawing>
-          <wp:inline distT="0" distB="0" distL="0" distR="0" wp14:anchorId="4E4717C1" wp14:editId="18673363">
-            <wp:extent cx="5334000" cy="3333750"/>
-            <wp:effectExtent l="0" t="0" r="0" b="0"/>
-            <wp:docPr id="11" name="Grafik 11"/>
-            <wp:cNvGraphicFramePr/>
-            <a:graphic xmlns:a="http://schemas.openxmlformats.org/drawingml/2006/main">
-              <a:graphicData uri="http://schemas.openxmlformats.org/drawingml/2006/picture">
-                <pic:pic xmlns:pic="http://schemas.openxmlformats.org/drawingml/2006/picture">
-                  <pic:nvPicPr>
-                    <pic:cNvPr id="11" name=""/>
-                    <pic:cNvPicPr/>
-                  </pic:nvPicPr>
-                  <pic:blipFill>
-                    <a:blip r:embed="rId19">
-                      <a:extLst>
-                        <a:ext uri="{28A0092B-C50C-407E-A947-70E740481C1C}">
-                          <a14:useLocalDpi xmlns:a14="http://schemas.microsoft.com/office/drawing/2010/main" val="0"/>
-                        </a:ext>
-                      </a:extLst>
-                    </a:blip>
-                    <a:stretch>
-                      <a:fillRect/>
-                    </a:stretch>
-                  </pic:blipFill>
-                  <pic:spPr>
-                    <a:xfrm>
-                      <a:off x="0" y="0"/>
-                      <a:ext cx="5334000" cy="3333750"/>
-                    </a:xfrm>
-                    <a:prstGeom prst="rect">
-                      <a:avLst/>
-                    </a:prstGeom>
-                  </pic:spPr>
-                </pic:pic>
-              </a:graphicData>
-            </a:graphic>
-          </wp:inline>
-        </w:drawing>
-      </w:r>
-    </w:p>
-    <w:tbl>
-      <w:tblPr>
-        <w:tblW w:w="9080" w:type="dxa"/>
-        <w:tblBorders>
-          <w:top w:val="single" w:sz="4" w:space="0" w:color="auto"/>
-          <w:left w:val="single" w:sz="4" w:space="0" w:color="auto"/>
-          <w:bottom w:val="single" w:sz="4" w:space="0" w:color="auto"/>
-          <w:right w:val="single" w:sz="4" w:space="0" w:color="auto"/>
-          <w:insideH w:val="single" w:sz="4" w:space="0" w:color="auto"/>
-          <w:insideV w:val="single" w:sz="4" w:space="0" w:color="auto"/>
-        </w:tblBorders>
-        <w:tblLayout w:type="fixed"/>
-        <w:tblCellMar>
-          <w:left w:w="70" w:type="dxa"/>
-          <w:right w:w="70" w:type="dxa"/>
-        </w:tblCellMar>
-        <w:tblLook w:val="0000" w:firstRow="0" w:lastRow="0" w:firstColumn="0" w:lastColumn="0" w:noHBand="0" w:noVBand="0"/>
-      </w:tblPr>
-      <w:tblGrid>
-        <w:gridCol w:w="680"/>
-        <w:gridCol w:w="8400"/>
-      </w:tblGrid>
-      <w:tr>
-        <w:trPr>
-          <w:tblHeader/>
-          <w:cantSplit/>
-        </w:trPr>
-        <w:tc>
-          <w:tcPr>
-            <w:tcW w:w="680" w:type="dxa"/>
-            <w:shd w:val="clear" w:color="auto" w:fill="2C5B39"/>
-          </w:tcPr>
-          <w:p>
-            <w:pPr>
-              <w:rPr>
-                <w:b/>
-                <w:color w:val="FFFFFF"/>
-                <w:sz w:val="20"/>
-              </w:rPr>
-            </w:pPr>
-            <w:r>
-              <w:rPr>
-                <w:b/>
-                <w:color w:val="FFFFFF"/>
-                <w:sz w:val="20"/>
-              </w:rPr>
-              <w:t>Nr.</w:t>
-            </w:r>
-          </w:p>
-        </w:tc>
-        <w:tc>
-          <w:tcPr>
-            <w:tcW w:w="8400" w:type="dxa"/>
-            <w:shd w:val="clear" w:color="auto" w:fill="2C5B39"/>
-          </w:tcPr>
-          <w:p>
-            <w:pPr>
-              <w:rPr>
-                <w:b/>
-                <w:color w:val="FFFFFF"/>
-                <w:sz w:val="20"/>
-              </w:rPr>
-            </w:pPr>
-            <w:r>
-              <w:rPr>
-                <w:b/>
-                <w:color w:val="FFFFFF"/>
-                <w:sz w:val="20"/>
-              </w:rPr>
-              <w:t>Element</w:t>
-            </w:r>
-          </w:p>
-        </w:tc>
-      </w:tr>
-      <w:tr>
-        <w:tc>
-          <w:tcPr>
-            <w:tcW w:w="680" w:type="dxa"/>
-            <w:shd w:val="clear" w:color="auto" w:fill="auto"/>
-          </w:tcPr>
-          <w:p>
-            <w:pPr>
-              <w:rPr>
-                <w:sz w:val="20"/>
-              </w:rPr>
-            </w:pPr>
-            <w:r>
-              <w:rPr>
-                <w:sz w:val="20"/>
-              </w:rPr>
-              <w:t>1</w:t>
-            </w:r>
-          </w:p>
-        </w:tc>
-        <w:tc>
-          <w:tcPr>
-            <w:tcW w:w="8400" w:type="dxa"/>
-            <w:shd w:val="clear" w:color="auto" w:fill="auto"/>
-          </w:tcPr>
-          <w:p>
-            <w:pPr>
-              <w:rPr>
-                <w:sz w:val="20"/>
-              </w:rPr>
-            </w:pPr>
-            <w:r>
-              <w:rPr>
-                <w:sz w:val="20"/>
-              </w:rPr>
-              <w:t>Datenquelle der Zuschläge (Server, lokale Vorschau oder Standarddaten).</w:t>
-            </w:r>
-          </w:p>
-        </w:tc>
-      </w:tr>
-      <w:tr>
-        <w:tc>
-          <w:tcPr>
-            <w:tcW w:w="680" w:type="dxa"/>
-            <w:shd w:val="clear" w:color="auto" w:fill="auto"/>
-          </w:tcPr>
-          <w:p>
-            <w:pPr>
-              <w:rPr>
-                <w:sz w:val="20"/>
-              </w:rPr>
-            </w:pPr>
-            <w:r>
-              <w:rPr>
-                <w:sz w:val="20"/>
-              </w:rPr>
-              <w:t>2</w:t>
-            </w:r>
-          </w:p>
-        </w:tc>
-        <w:tc>
-          <w:tcPr>
-            <w:tcW w:w="8400" w:type="dxa"/>
-            <w:shd w:val="clear" w:color="auto" w:fill="auto"/>
-          </w:tcPr>
-          <w:p>
-            <w:pPr>
-              <w:rPr>
-                <w:sz w:val="20"/>
-              </w:rPr>
-            </w:pPr>
-            <w:r>
-              <w:rPr>
-                <w:sz w:val="20"/>
-              </w:rPr>
-              <w:t>Bezeichnung eines Zuschlagspostens - direkt bearbeitbar.</w:t>
-            </w:r>
-          </w:p>
-        </w:tc>
-      </w:tr>
-      <w:tr>
-        <w:tc>
-          <w:tcPr>
-            <w:tcW w:w="680" w:type="dxa"/>
-            <w:shd w:val="clear" w:color="auto" w:fill="auto"/>
-          </w:tcPr>
-          <w:p>
-            <w:pPr>
-              <w:rPr>
-                <w:sz w:val="20"/>
-              </w:rPr>
-            </w:pPr>
-            <w:r>
-              <w:rPr>
-                <w:sz w:val="20"/>
-              </w:rPr>
-              <w:t>3</w:t>
-            </w:r>
-          </w:p>
-        </w:tc>
-        <w:tc>
-          <w:tcPr>
-            <w:tcW w:w="8400" w:type="dxa"/>
-            <w:shd w:val="clear" w:color="auto" w:fill="auto"/>
-          </w:tcPr>
-          <w:p>
-            <w:pPr>
-              <w:rPr>
-                <w:sz w:val="20"/>
-              </w:rPr>
-            </w:pPr>
-            <w:r>
-              <w:rPr>
-                <w:sz w:val="20"/>
-              </w:rPr>
-              <w:t>Prozentsatz dieses Postens - direkt bearbeitbar.</w:t>
-            </w:r>
-          </w:p>
-        </w:tc>
-      </w:tr>
-      <w:tr>
-        <w:tc>
-          <w:tcPr>
-            <w:tcW w:w="680" w:type="dxa"/>
-            <w:shd w:val="clear" w:color="auto" w:fill="auto"/>
-          </w:tcPr>
-          <w:p>
-            <w:pPr>
-              <w:rPr>
-                <w:sz w:val="20"/>
-              </w:rPr>
-            </w:pPr>
-            <w:r>
-              <w:rPr>
-                <w:sz w:val="20"/>
-              </w:rPr>
-              <w:t>4</w:t>
-            </w:r>
-          </w:p>
-        </w:tc>
-        <w:tc>
-          <w:tcPr>
-            <w:tcW w:w="8400" w:type="dxa"/>
-            <w:shd w:val="clear" w:color="auto" w:fill="auto"/>
-          </w:tcPr>
-          <w:p>
-            <w:pPr>
-              <w:rPr>
-                <w:sz w:val="20"/>
-              </w:rPr>
-            </w:pPr>
-            <w:r>
-              <w:rPr>
-                <w:sz w:val="20"/>
-              </w:rPr>
-              <w:t>Entfernen-Button für diesen Posten.</w:t>
-            </w:r>
-          </w:p>
-        </w:tc>
-      </w:tr>
-      <w:tr>
-        <w:tc>
-          <w:tcPr>
-            <w:tcW w:w="680" w:type="dxa"/>
-            <w:shd w:val="clear" w:color="auto" w:fill="auto"/>
-          </w:tcPr>
-          <w:p>
-            <w:pPr>
-              <w:rPr>
-                <w:sz w:val="20"/>
-              </w:rPr>
-            </w:pPr>
-            <w:r>
-              <w:rPr>
-                <w:sz w:val="20"/>
-              </w:rPr>
-              <w:t>5</w:t>
-            </w:r>
-          </w:p>
-        </w:tc>
-        <w:tc>
-          <w:tcPr>
-            <w:tcW w:w="8400" w:type="dxa"/>
-            <w:shd w:val="clear" w:color="auto" w:fill="auto"/>
-          </w:tcPr>
-          <w:p>
-            <w:pPr>
-              <w:rPr>
-                <w:sz w:val="20"/>
-              </w:rPr>
-            </w:pPr>
-            <w:r>
-              <w:rPr>
-                <w:sz w:val="20"/>
-              </w:rPr>
-              <w:t>Button "+ Zuschlag hinzufügen" - legt einen neuen, leeren Posten an.</w:t>
-            </w:r>
-          </w:p>
-        </w:tc>
-      </w:tr>
-      <w:tr>
-        <w:tc>
-          <w:tcPr>
-            <w:tcW w:w="680" w:type="dxa"/>
-            <w:shd w:val="clear" w:color="auto" w:fill="auto"/>
-          </w:tcPr>
-          <w:p>
-            <w:pPr>
-              <w:rPr>
-                <w:sz w:val="20"/>
-              </w:rPr>
-            </w:pPr>
-            <w:r>
-              <w:rPr>
-                <w:sz w:val="20"/>
-              </w:rPr>
-              <w:t>6</w:t>
-            </w:r>
-          </w:p>
-        </w:tc>
-        <w:tc>
-          <w:tcPr>
-            <w:tcW w:w="8400" w:type="dxa"/>
-            <w:shd w:val="clear" w:color="auto" w:fill="auto"/>
-          </w:tcPr>
-          <w:p>
-            <w:pPr>
-              <w:rPr>
-                <w:sz w:val="20"/>
-              </w:rPr>
-            </w:pPr>
-            <w:r>
-              <w:rPr>
-                <w:sz w:val="20"/>
-              </w:rPr>
-              <w:t>Automatisch berechneter Gesamt-Zuschlag (Summe aller Posten).</w:t>
-            </w:r>
-          </w:p>
-        </w:tc>
-      </w:tr>
-      <w:tr>
-        <w:tc>
-          <w:tcPr>
-            <w:tcW w:w="680" w:type="dxa"/>
-            <w:shd w:val="clear" w:color="auto" w:fill="auto"/>
-          </w:tcPr>
-          <w:p>
-            <w:pPr>
-              <w:rPr>
-                <w:sz w:val="20"/>
-              </w:rPr>
-            </w:pPr>
-            <w:r>
-              <w:rPr>
-                <w:sz w:val="20"/>
-              </w:rPr>
-              <w:t>7</w:t>
-            </w:r>
-          </w:p>
-        </w:tc>
-        <w:tc>
-          <w:tcPr>
-            <w:tcW w:w="8400" w:type="dxa"/>
-            <w:shd w:val="clear" w:color="auto" w:fill="auto"/>
-          </w:tcPr>
-          <w:p>
-            <w:pPr>
-              <w:rPr>
-                <w:sz w:val="20"/>
-              </w:rPr>
-            </w:pPr>
-            <w:r>
-              <w:rPr>
-                <w:sz w:val="20"/>
-              </w:rPr>
-              <w:t>Manuelles Eingabefeld, um den Gesamt-Zuschlag ohne Änderung der Einzelposten zu überschreiben.</w:t>
-            </w:r>
-          </w:p>
-        </w:tc>
-      </w:tr>
-      <w:tr>
-        <w:tc>
-          <w:tcPr>
-            <w:tcW w:w="680" w:type="dxa"/>
-            <w:shd w:val="clear" w:color="auto" w:fill="auto"/>
-          </w:tcPr>
-          <w:p>
-            <w:pPr>
-              <w:rPr>
-                <w:sz w:val="20"/>
-              </w:rPr>
-            </w:pPr>
-            <w:r>
-              <w:rPr>
-                <w:sz w:val="20"/>
-              </w:rPr>
-              <w:t>8</w:t>
-            </w:r>
-          </w:p>
-        </w:tc>
-        <w:tc>
-          <w:tcPr>
-            <w:tcW w:w="8400" w:type="dxa"/>
-            <w:shd w:val="clear" w:color="auto" w:fill="auto"/>
-          </w:tcPr>
-          <w:p>
-            <w:pPr>
-              <w:rPr>
-                <w:sz w:val="20"/>
-              </w:rPr>
-            </w:pPr>
-            <w:r>
-              <w:rPr>
-                <w:sz w:val="20"/>
-              </w:rPr>
-              <w:t>Button "Zurücksetzen" - löscht die manuelle Überschreibung wieder.</w:t>
-            </w:r>
-          </w:p>
-        </w:tc>
-      </w:tr>
-      <w:tr>
-        <w:tc>
-          <w:tcPr>
-            <w:tcW w:w="680" w:type="dxa"/>
-            <w:shd w:val="clear" w:color="auto" w:fill="auto"/>
-          </w:tcPr>
-          <w:p>
-            <w:pPr>
-              <w:rPr>
-                <w:sz w:val="20"/>
-              </w:rPr>
-            </w:pPr>
-            <w:r>
-              <w:rPr>
-                <w:sz w:val="20"/>
-              </w:rPr>
-              <w:t>9</w:t>
-            </w:r>
-          </w:p>
-        </w:tc>
-        <w:tc>
-          <w:tcPr>
-            <w:tcW w:w="8400" w:type="dxa"/>
-            <w:shd w:val="clear" w:color="auto" w:fill="auto"/>
-          </w:tcPr>
-          <w:p>
-            <w:pPr>
-              <w:rPr>
-                <w:sz w:val="20"/>
-              </w:rPr>
-            </w:pPr>
-            <w:r>
-              <w:rPr>
-                <w:sz w:val="20"/>
-              </w:rPr>
-              <w:t>Button zum Hochladen einer Zuschläge-CSV (ersetzt alle Felder).</w:t>
-            </w:r>
-          </w:p>
-        </w:tc>
-      </w:tr>
-      <w:tr>
-        <w:tc>
-          <w:tcPr>
-            <w:tcW w:w="680" w:type="dxa"/>
-            <w:shd w:val="clear" w:color="auto" w:fill="auto"/>
-          </w:tcPr>
-          <w:p>
-            <w:pPr>
-              <w:rPr>
-                <w:sz w:val="20"/>
-              </w:rPr>
-            </w:pPr>
-            <w:r>
-              <w:rPr>
-                <w:sz w:val="20"/>
-              </w:rPr>
-              <w:t>10</w:t>
-            </w:r>
-          </w:p>
-        </w:tc>
-        <w:tc>
-          <w:tcPr>
-            <w:tcW w:w="8400" w:type="dxa"/>
-            <w:shd w:val="clear" w:color="auto" w:fill="auto"/>
-          </w:tcPr>
-          <w:p>
-            <w:pPr>
-              <w:rPr>
-                <w:sz w:val="20"/>
-              </w:rPr>
-            </w:pPr>
-            <w:r>
-              <w:rPr>
-                <w:sz w:val="20"/>
-              </w:rPr>
-              <w:t>Button "Zuschläge als CSV exportieren".</w:t>
-            </w:r>
-          </w:p>
-        </w:tc>
-      </w:tr>
-    </w:tbl>
-    <w:p/>
-    <w:p>
-      <w:r>
-        <w:br w:type="page"/>
-      </w:r>
-    </w:p>
-    <w:p>
-      <w:pPr>
-        <w:pStyle w:val="berschrift2"/>
-      </w:pPr>
-      <w:bookmarkStart w:id="17" w:name="_Toc238900584"/>
-      <w:r>
-        <w:lastRenderedPageBreak/>
-        <w:t>6.6 Kundenkonten</w:t>
-      </w:r>
-      <w:bookmarkEnd w:id="17"/>
-    </w:p>
-    <w:p>
-      <w:r>
-        <w:t>Da Kundenkonten nur lokal gespeichert werden, zeigt dieser Bereich ausschließlich die auf diesem Gerät registrierten Konten.</w:t>
-      </w:r>
-    </w:p>
-    <w:p>
-      <w:pPr>
-        <w:jc w:val="center"/>
-      </w:pPr>
-      <w:r>
-        <w:rPr>
-          <w:noProof/>
-        </w:rPr>
-        <w:drawing>
-          <wp:inline distT="0" distB="0" distL="0" distR="0" wp14:anchorId="4A2B227F" wp14:editId="73D7518D">
-            <wp:extent cx="5080000" cy="1032015"/>
-            <wp:effectExtent l="0" t="0" r="6350" b="0"/>
-            <wp:docPr id="12" name="Grafik 12"/>
-            <wp:cNvGraphicFramePr/>
-            <a:graphic xmlns:a="http://schemas.openxmlformats.org/drawingml/2006/main">
-              <a:graphicData uri="http://schemas.openxmlformats.org/drawingml/2006/picture">
-                <pic:pic xmlns:pic="http://schemas.openxmlformats.org/drawingml/2006/picture">
-                  <pic:nvPicPr>
-                    <pic:cNvPr id="12" name=""/>
-                    <pic:cNvPicPr/>
-                  </pic:nvPicPr>
-                  <pic:blipFill>
-                    <a:blip r:embed="rId20" cstate="print">
-                      <a:extLst>
-                        <a:ext uri="{28A0092B-C50C-407E-A947-70E740481C1C}">
-                          <a14:useLocalDpi xmlns:a14="http://schemas.microsoft.com/office/drawing/2010/main" val="0"/>
-                        </a:ext>
-                      </a:extLst>
-                    </a:blip>
-                    <a:stretch>
-                      <a:fillRect/>
-                    </a:stretch>
-                  </pic:blipFill>
-                  <pic:spPr>
-                    <a:xfrm>
-                      <a:off x="0" y="0"/>
-                      <a:ext cx="5080000" cy="1032015"/>
-                    </a:xfrm>
-                    <a:prstGeom prst="rect">
-                      <a:avLst/>
-                    </a:prstGeom>
-                  </pic:spPr>
-                </pic:pic>
-              </a:graphicData>
-            </a:graphic>
-          </wp:inline>
-        </w:drawing>
-      </w:r>
-    </w:p>
-    <w:tbl>
-      <w:tblPr>
-        <w:tblW w:w="9080" w:type="dxa"/>
-        <w:tblBorders>
-          <w:top w:val="single" w:sz="4" w:space="0" w:color="auto"/>
-          <w:left w:val="single" w:sz="4" w:space="0" w:color="auto"/>
-          <w:bottom w:val="single" w:sz="4" w:space="0" w:color="auto"/>
-          <w:right w:val="single" w:sz="4" w:space="0" w:color="auto"/>
-          <w:insideH w:val="single" w:sz="4" w:space="0" w:color="auto"/>
-          <w:insideV w:val="single" w:sz="4" w:space="0" w:color="auto"/>
-        </w:tblBorders>
-        <w:tblLayout w:type="fixed"/>
-        <w:tblCellMar>
-          <w:left w:w="70" w:type="dxa"/>
-          <w:right w:w="70" w:type="dxa"/>
-        </w:tblCellMar>
-        <w:tblLook w:val="0000" w:firstRow="0" w:lastRow="0" w:firstColumn="0" w:lastColumn="0" w:noHBand="0" w:noVBand="0"/>
-      </w:tblPr>
-      <w:tblGrid>
-        <w:gridCol w:w="680"/>
-        <w:gridCol w:w="8400"/>
-      </w:tblGrid>
-      <w:tr>
-        <w:trPr>
-          <w:tblHeader/>
-          <w:cantSplit/>
-        </w:trPr>
-        <w:tc>
-          <w:tcPr>
-            <w:tcW w:w="680" w:type="dxa"/>
-            <w:shd w:val="clear" w:color="auto" w:fill="2C5B39"/>
-          </w:tcPr>
-          <w:p>
-            <w:pPr>
-              <w:rPr>
-                <w:b/>
-                <w:color w:val="FFFFFF"/>
-                <w:sz w:val="20"/>
-              </w:rPr>
-            </w:pPr>
-            <w:r>
-              <w:rPr>
-                <w:b/>
-                <w:color w:val="FFFFFF"/>
-                <w:sz w:val="20"/>
-              </w:rPr>
-              <w:t>Nr.</w:t>
-            </w:r>
-          </w:p>
-        </w:tc>
-        <w:tc>
-          <w:tcPr>
-            <w:tcW w:w="8400" w:type="dxa"/>
-            <w:shd w:val="clear" w:color="auto" w:fill="2C5B39"/>
-          </w:tcPr>
-          <w:p>
-            <w:pPr>
-              <w:rPr>
-                <w:b/>
-                <w:color w:val="FFFFFF"/>
-                <w:sz w:val="20"/>
-              </w:rPr>
-            </w:pPr>
-            <w:r>
-              <w:rPr>
-                <w:b/>
-                <w:color w:val="FFFFFF"/>
-                <w:sz w:val="20"/>
-              </w:rPr>
-              <w:t>Element</w:t>
-            </w:r>
-          </w:p>
-        </w:tc>
-      </w:tr>
-      <w:tr>
-        <w:tc>
-          <w:tcPr>
-            <w:tcW w:w="680" w:type="dxa"/>
-            <w:shd w:val="clear" w:color="auto" w:fill="auto"/>
-          </w:tcPr>
-          <w:p>
-            <w:pPr>
-              <w:rPr>
-                <w:sz w:val="20"/>
-              </w:rPr>
-            </w:pPr>
-            <w:r>
-              <w:rPr>
-                <w:sz w:val="20"/>
-              </w:rPr>
-              <w:t>1</w:t>
-            </w:r>
-          </w:p>
-        </w:tc>
-        <w:tc>
-          <w:tcPr>
-            <w:tcW w:w="8400" w:type="dxa"/>
-            <w:shd w:val="clear" w:color="auto" w:fill="auto"/>
-          </w:tcPr>
-          <w:p>
-            <w:pPr>
-              <w:rPr>
-                <w:sz w:val="20"/>
-              </w:rPr>
-            </w:pPr>
-            <w:r>
-              <w:rPr>
-                <w:sz w:val="20"/>
-              </w:rPr>
-              <w:t>Button "Kundenkonten als CSV exportieren" (Spalten: Benutzername, E-Mail, Salt, Hash, Erstellt - Passwörter nie im Klartext).</w:t>
-            </w:r>
-          </w:p>
-        </w:tc>
-      </w:tr>
-      <w:tr>
-        <w:tc>
-          <w:tcPr>
-            <w:tcW w:w="680" w:type="dxa"/>
-            <w:shd w:val="clear" w:color="auto" w:fill="auto"/>
-          </w:tcPr>
-          <w:p>
-            <w:pPr>
-              <w:rPr>
-                <w:sz w:val="20"/>
-              </w:rPr>
-            </w:pPr>
-            <w:r>
-              <w:rPr>
-                <w:sz w:val="20"/>
-              </w:rPr>
-              <w:t>2</w:t>
-            </w:r>
-          </w:p>
-        </w:tc>
-        <w:tc>
-          <w:tcPr>
-            <w:tcW w:w="8400" w:type="dxa"/>
-            <w:shd w:val="clear" w:color="auto" w:fill="auto"/>
-          </w:tcPr>
-          <w:p>
-            <w:pPr>
-              <w:rPr>
-                <w:sz w:val="20"/>
-              </w:rPr>
-            </w:pPr>
-            <w:r>
-              <w:rPr>
-                <w:sz w:val="20"/>
-              </w:rPr>
-              <w:t>Button zum Hochladen einer Kundenkonten-CSV (ersetzt alle Konten auf diesem Gerät).</w:t>
-            </w:r>
-          </w:p>
-        </w:tc>
-      </w:tr>
-    </w:tbl>
-    <w:p/>
-    <w:p>
-      <w:pPr>
-        <w:pStyle w:val="berschrift2"/>
-      </w:pPr>
-      <w:bookmarkStart w:id="18" w:name="_Toc238900585"/>
-      <w:r>
-        <w:t>6.7 Admin-Passwort ändern</w:t>
-      </w:r>
-      <w:bookmarkEnd w:id="18"/>
-    </w:p>
-    <w:p>
-      <w:pPr>
-        <w:jc w:val="center"/>
-      </w:pPr>
-      <w:r>
-        <w:rPr>
-          <w:noProof/>
-        </w:rPr>
-        <w:drawing>
-          <wp:inline distT="0" distB="0" distL="0" distR="0" wp14:anchorId="26609240" wp14:editId="61D756D2">
-            <wp:extent cx="5334000" cy="2417116"/>
-            <wp:effectExtent l="0" t="0" r="0" b="2540"/>
-            <wp:docPr id="13" name="Grafik 13"/>
-            <wp:cNvGraphicFramePr/>
-            <a:graphic xmlns:a="http://schemas.openxmlformats.org/drawingml/2006/main">
-              <a:graphicData uri="http://schemas.openxmlformats.org/drawingml/2006/picture">
-                <pic:pic xmlns:pic="http://schemas.openxmlformats.org/drawingml/2006/picture">
-                  <pic:nvPicPr>
-                    <pic:cNvPr id="13" name=""/>
-                    <pic:cNvPicPr/>
-                  </pic:nvPicPr>
-                  <pic:blipFill>
-                    <a:blip r:embed="rId21">
-                      <a:extLst>
-                        <a:ext uri="{28A0092B-C50C-407E-A947-70E740481C1C}">
-                          <a14:useLocalDpi xmlns:a14="http://schemas.microsoft.com/office/drawing/2010/main" val="0"/>
-                        </a:ext>
-                      </a:extLst>
-                    </a:blip>
-                    <a:stretch>
-                      <a:fillRect/>
-                    </a:stretch>
-                  </pic:blipFill>
-                  <pic:spPr>
-                    <a:xfrm>
-                      <a:off x="0" y="0"/>
-                      <a:ext cx="5334000" cy="2417116"/>
-                    </a:xfrm>
-                    <a:prstGeom prst="rect">
-                      <a:avLst/>
-                    </a:prstGeom>
-                  </pic:spPr>
-                </pic:pic>
-              </a:graphicData>
-            </a:graphic>
-          </wp:inline>
-        </w:drawing>
-      </w:r>
-    </w:p>
-    <w:tbl>
-      <w:tblPr>
-        <w:tblW w:w="9080" w:type="dxa"/>
-        <w:tblBorders>
-          <w:top w:val="single" w:sz="4" w:space="0" w:color="auto"/>
-          <w:left w:val="single" w:sz="4" w:space="0" w:color="auto"/>
-          <w:bottom w:val="single" w:sz="4" w:space="0" w:color="auto"/>
-          <w:right w:val="single" w:sz="4" w:space="0" w:color="auto"/>
-          <w:insideH w:val="single" w:sz="4" w:space="0" w:color="auto"/>
-          <w:insideV w:val="single" w:sz="4" w:space="0" w:color="auto"/>
-        </w:tblBorders>
-        <w:tblLayout w:type="fixed"/>
-        <w:tblCellMar>
-          <w:left w:w="70" w:type="dxa"/>
-          <w:right w:w="70" w:type="dxa"/>
-        </w:tblCellMar>
-        <w:tblLook w:val="0000" w:firstRow="0" w:lastRow="0" w:firstColumn="0" w:lastColumn="0" w:noHBand="0" w:noVBand="0"/>
-      </w:tblPr>
-      <w:tblGrid>
-        <w:gridCol w:w="680"/>
-        <w:gridCol w:w="8400"/>
-      </w:tblGrid>
-      <w:tr>
-        <w:trPr>
-          <w:tblHeader/>
-          <w:cantSplit/>
-        </w:trPr>
-        <w:tc>
-          <w:tcPr>
-            <w:tcW w:w="680" w:type="dxa"/>
-            <w:shd w:val="clear" w:color="auto" w:fill="2C5B39"/>
-          </w:tcPr>
-          <w:p>
-            <w:pPr>
-              <w:rPr>
-                <w:b/>
-                <w:color w:val="FFFFFF"/>
-                <w:sz w:val="20"/>
-              </w:rPr>
-            </w:pPr>
-            <w:r>
-              <w:rPr>
-                <w:b/>
-                <w:color w:val="FFFFFF"/>
-                <w:sz w:val="20"/>
-              </w:rPr>
-              <w:t>Nr.</w:t>
-            </w:r>
-          </w:p>
-        </w:tc>
-        <w:tc>
-          <w:tcPr>
-            <w:tcW w:w="8400" w:type="dxa"/>
-            <w:shd w:val="clear" w:color="auto" w:fill="2C5B39"/>
-          </w:tcPr>
-          <w:p>
-            <w:pPr>
-              <w:rPr>
-                <w:b/>
-                <w:color w:val="FFFFFF"/>
-                <w:sz w:val="20"/>
-              </w:rPr>
-            </w:pPr>
-            <w:r>
-              <w:rPr>
-                <w:b/>
-                <w:color w:val="FFFFFF"/>
-                <w:sz w:val="20"/>
-              </w:rPr>
-              <w:t>Element</w:t>
-            </w:r>
-          </w:p>
-        </w:tc>
-      </w:tr>
-      <w:tr>
-        <w:tc>
-          <w:tcPr>
-            <w:tcW w:w="680" w:type="dxa"/>
-            <w:shd w:val="clear" w:color="auto" w:fill="auto"/>
-          </w:tcPr>
-          <w:p>
-            <w:pPr>
-              <w:rPr>
-                <w:sz w:val="20"/>
-              </w:rPr>
-            </w:pPr>
-            <w:r>
-              <w:rPr>
-                <w:sz w:val="20"/>
-              </w:rPr>
-              <w:t>1</w:t>
-            </w:r>
-          </w:p>
-        </w:tc>
-        <w:tc>
-          <w:tcPr>
-            <w:tcW w:w="8400" w:type="dxa"/>
-            <w:shd w:val="clear" w:color="auto" w:fill="auto"/>
-          </w:tcPr>
-          <w:p>
-            <w:pPr>
-              <w:rPr>
-                <w:sz w:val="20"/>
-              </w:rPr>
-            </w:pPr>
-            <w:r>
-              <w:rPr>
-                <w:sz w:val="20"/>
-              </w:rPr>
-              <w:t>Eingabefeld Aktuelles Passwort.</w:t>
-            </w:r>
-          </w:p>
-        </w:tc>
-      </w:tr>
-      <w:tr>
-        <w:tc>
-          <w:tcPr>
-            <w:tcW w:w="680" w:type="dxa"/>
-            <w:shd w:val="clear" w:color="auto" w:fill="auto"/>
-          </w:tcPr>
-          <w:p>
-            <w:pPr>
-              <w:rPr>
-                <w:sz w:val="20"/>
-              </w:rPr>
-            </w:pPr>
-            <w:r>
-              <w:rPr>
-                <w:sz w:val="20"/>
-              </w:rPr>
-              <w:t>2</w:t>
-            </w:r>
-          </w:p>
-        </w:tc>
-        <w:tc>
-          <w:tcPr>
-            <w:tcW w:w="8400" w:type="dxa"/>
-            <w:shd w:val="clear" w:color="auto" w:fill="auto"/>
-          </w:tcPr>
-          <w:p>
-            <w:pPr>
-              <w:rPr>
-                <w:sz w:val="20"/>
-              </w:rPr>
-            </w:pPr>
-            <w:r>
-              <w:rPr>
-                <w:sz w:val="20"/>
-              </w:rPr>
-              <w:t>Eingabefeld Neues Passwort.</w:t>
-            </w:r>
-          </w:p>
-        </w:tc>
-      </w:tr>
-      <w:tr>
-        <w:tc>
-          <w:tcPr>
-            <w:tcW w:w="680" w:type="dxa"/>
-            <w:shd w:val="clear" w:color="auto" w:fill="auto"/>
-          </w:tcPr>
-          <w:p>
-            <w:pPr>
-              <w:rPr>
-                <w:sz w:val="20"/>
-              </w:rPr>
-            </w:pPr>
-            <w:r>
-              <w:rPr>
-                <w:sz w:val="20"/>
-              </w:rPr>
-              <w:t>3</w:t>
-            </w:r>
-          </w:p>
-        </w:tc>
-        <w:tc>
-          <w:tcPr>
-            <w:tcW w:w="8400" w:type="dxa"/>
-            <w:shd w:val="clear" w:color="auto" w:fill="auto"/>
-          </w:tcPr>
-          <w:p>
-            <w:pPr>
-              <w:rPr>
-                <w:sz w:val="20"/>
-              </w:rPr>
-            </w:pPr>
-            <w:r>
-              <w:rPr>
-                <w:sz w:val="20"/>
-              </w:rPr>
-              <w:t>Eingabefeld Neues Passwort wiederholen.</w:t>
-            </w:r>
-          </w:p>
-        </w:tc>
-      </w:tr>
-      <w:tr>
-        <w:tc>
-          <w:tcPr>
-            <w:tcW w:w="680" w:type="dxa"/>
-            <w:shd w:val="clear" w:color="auto" w:fill="auto"/>
-          </w:tcPr>
-          <w:p>
-            <w:pPr>
-              <w:rPr>
-                <w:sz w:val="20"/>
-              </w:rPr>
-            </w:pPr>
-            <w:r>
-              <w:rPr>
-                <w:sz w:val="20"/>
-              </w:rPr>
-              <w:t>4</w:t>
-            </w:r>
-          </w:p>
-        </w:tc>
-        <w:tc>
-          <w:tcPr>
-            <w:tcW w:w="8400" w:type="dxa"/>
-            <w:shd w:val="clear" w:color="auto" w:fill="auto"/>
-          </w:tcPr>
-          <w:p>
-            <w:pPr>
-              <w:rPr>
-                <w:sz w:val="20"/>
-              </w:rPr>
-            </w:pPr>
-            <w:r>
-              <w:rPr>
-                <w:sz w:val="20"/>
-              </w:rPr>
-              <w:t>Button "Passwort ändern".</w:t>
-            </w:r>
-          </w:p>
-        </w:tc>
-      </w:tr>
-    </w:tbl>
-    <w:p/>
-    <w:p>
-      <w:r>
-        <w:t>Im Anschluss an diesen Bereich befindet sich zusätzlich der Button "Auf Original-Bodan-Daten zurücksetzen", der Produktkatalog und Zuschläge auf die eingebetteten Ausgangsdaten zurücksetzt (Kundenkonten bleiben dabei erhalten).</w:t>
-      </w:r>
-    </w:p>
-    <w:p>
-      <w:r>
-        <w:br w:type="page"/>
-      </w:r>
-    </w:p>
-    <w:p>
-      <w:pPr>
-        <w:pStyle w:val="berschrift1"/>
-      </w:pPr>
-      <w:bookmarkStart w:id="19" w:name="_Toc238900586"/>
-      <w:r>
-        <w:lastRenderedPageBreak/>
-        <w:t>7. Ablauf einer Bestellung - Schritt für Schritt</w:t>
+        <w:t>6. Ablauf einer Bestellung - Schritt für Schritt</w:t>
       </w:r>
       <w:bookmarkEnd w:id="19"/>
     </w:p>

</xml_diff>